<commit_message>
test: Add test script and fix Legal500 template tags
- Converted `{% tr %}` and `{% p %}` custom tags in the Legal500 docx template to standard `{% for %}` tags to support the custom SilentUndefined Jinja environment.
- Fixed unclosed Jinja tags and mismatched variable names (e.g. `lead_partners` to `leading_partners`, `other_key_team_members` to `other_partners`).
- Added a standalone test script `test_legal500_template.py` to assert that complex template structures like matters can be dynamically rendered.

Co-authored-by: miguelmolina-dev <59732546+miguelmolina-dev@users.noreply.github.com>
</commit_message>
<xml_diff>
--- a/templates/legal500-us-submissions-template-2026-1-1-2.docx
+++ b/templates/legal500-us-submissions-template-2026-1-1-2.docx
@@ -3770,86 +3770,10 @@
             <w:shd w:val="clear" w:color="auto" w:fill="C5E0B3" w:themeFill="accent6" w:themeFillTint="66"/>
           </w:tcPr>
           <w:p>
-            <w:pPr>
-              <w:rPr>
-                <w:b/>
-                <w:color w:val="767171" w:themeColor="background2" w:themeShade="80"/>
-              </w:rPr>
-            </w:pPr>
-            <w:r>
-              <w:rPr>
-                <w:b/>
-              </w:rPr>
-              <w:t xml:space="preserve">Active key clients </w:t>
-            </w:r>
-            <w:r>
-              <w:rPr>
-                <w:b/>
-                <w:color w:val="767171" w:themeColor="background2" w:themeShade="80"/>
-              </w:rPr>
-              <w:t>(</w:t>
-            </w:r>
-            <w:r>
-              <w:rPr>
-                <w:b/>
-                <w:color w:val="767171" w:themeColor="background2" w:themeShade="80"/>
-              </w:rPr>
-              <w:t xml:space="preserve">over </w:t>
-            </w:r>
-            <w:r>
-              <w:rPr>
-                <w:b/>
-                <w:color w:val="767171" w:themeColor="background2" w:themeShade="80"/>
-              </w:rPr>
-              <w:t xml:space="preserve">the </w:t>
-            </w:r>
-            <w:r>
-              <w:rPr>
-                <w:b/>
-                <w:color w:val="767171" w:themeColor="background2" w:themeShade="80"/>
-              </w:rPr>
-              <w:t>last 12 months)</w:t>
-            </w:r>
-          </w:p>
-          <w:p>
-            <w:pPr>
-              <w:rPr>
-                <w:b/>
-              </w:rPr>
-            </w:pPr>
-            <w:r>
-              <w:rPr>
-                <w:b/>
-              </w:rPr>
-              <w:t xml:space="preserve">{% </w:t>
-            </w:r>
-            <w:proofErr w:type="spellStart"/>
-            <w:r>
-              <w:rPr>
-                <w:b/>
-              </w:rPr>
-              <w:t>tr</w:t>
-            </w:r>
-            <w:proofErr w:type="spellEnd"/>
-            <w:r>
-              <w:rPr>
-                <w:b/>
-              </w:rPr>
-              <w:t xml:space="preserve"> for client in </w:t>
-            </w:r>
-            <w:proofErr w:type="spellStart"/>
-            <w:r>
-              <w:rPr>
-                <w:b/>
-              </w:rPr>
-              <w:t>publishable_clients</w:t>
-            </w:r>
-            <w:proofErr w:type="spellEnd"/>
-            <w:r>
-              <w:rPr>
-                <w:b/>
-              </w:rPr>
-              <w:t xml:space="preserve"> %}</w:t>
+            <w:r>
+              <w:t>Active key clients (over the last 12 months)</w:t>
+              <w:br/>
+              <w:t>{% for client in publishable_clients %}</w:t>
             </w:r>
           </w:p>
         </w:tc>
@@ -3929,38 +3853,8 @@
             <w:shd w:val="clear" w:color="auto" w:fill="E2EFD9" w:themeFill="accent6" w:themeFillTint="33"/>
           </w:tcPr>
           <w:p>
-            <w:pPr>
-              <w:rPr>
-                <w:b/>
-                <w:sz w:val="28"/>
-                <w:szCs w:val="28"/>
-              </w:rPr>
-            </w:pPr>
-            <w:r>
-              <w:rPr>
-                <w:b/>
-                <w:sz w:val="28"/>
-                <w:szCs w:val="28"/>
-              </w:rPr>
-              <w:t xml:space="preserve">{{ </w:t>
-            </w:r>
-            <w:proofErr w:type="spellStart"/>
-            <w:r>
-              <w:rPr>
-                <w:b/>
-                <w:sz w:val="28"/>
-                <w:szCs w:val="28"/>
-              </w:rPr>
-              <w:t>client.is_new_client</w:t>
-            </w:r>
-            <w:proofErr w:type="spellEnd"/>
-            <w:r>
-              <w:rPr>
-                <w:b/>
-                <w:sz w:val="28"/>
-                <w:szCs w:val="28"/>
-              </w:rPr>
-              <w:t xml:space="preserve"> }}</w:t>
+            <w:r>
+              <w:t>{{ client.is_new_client }}}</w:t>
             </w:r>
           </w:p>
         </w:tc>
@@ -4228,56 +4122,8 @@
             <w:shd w:val="clear" w:color="auto" w:fill="E2EFD9" w:themeFill="accent6" w:themeFillTint="33"/>
           </w:tcPr>
           <w:p>
-            <w:pPr>
-              <w:rPr>
-                <w:b/>
-                <w:sz w:val="28"/>
-                <w:szCs w:val="28"/>
-              </w:rPr>
-            </w:pPr>
-            <w:r>
-              <w:rPr>
-                <w:b/>
-                <w:sz w:val="28"/>
-                <w:szCs w:val="28"/>
-              </w:rPr>
-              <w:t xml:space="preserve">{% </w:t>
-            </w:r>
-            <w:proofErr w:type="spellStart"/>
-            <w:r>
-              <w:rPr>
-                <w:b/>
-                <w:sz w:val="28"/>
-                <w:szCs w:val="28"/>
-              </w:rPr>
-              <w:t>tr</w:t>
-            </w:r>
-            <w:proofErr w:type="spellEnd"/>
-            <w:r>
-              <w:rPr>
-                <w:b/>
-                <w:sz w:val="28"/>
-                <w:szCs w:val="28"/>
-              </w:rPr>
-              <w:t xml:space="preserve"> </w:t>
-            </w:r>
-            <w:proofErr w:type="spellStart"/>
-            <w:r>
-              <w:rPr>
-                <w:b/>
-                <w:sz w:val="28"/>
-                <w:szCs w:val="28"/>
-              </w:rPr>
-              <w:t>endfor</w:t>
-            </w:r>
-            <w:proofErr w:type="spellEnd"/>
-            <w:r>
-              <w:rPr>
-                <w:b/>
-                <w:sz w:val="28"/>
-                <w:szCs w:val="28"/>
-              </w:rPr>
-              <w:t xml:space="preserve"> %}</w:t>
+            <w:r>
+              <w:t>{% endfor %}</w:t>
             </w:r>
           </w:p>
         </w:tc>
@@ -4394,87 +4240,11 @@
             <w:shd w:val="clear" w:color="auto" w:fill="F1A3A3"/>
           </w:tcPr>
           <w:p>
-            <w:pPr>
-              <w:rPr>
-                <w:b/>
-                <w:color w:val="767171" w:themeColor="background2" w:themeShade="80"/>
-              </w:rPr>
-            </w:pPr>
-            <w:r>
-              <w:rPr>
-                <w:b/>
-              </w:rPr>
-              <w:t xml:space="preserve">Active key clients </w:t>
-            </w:r>
-            <w:r>
-              <w:rPr>
-                <w:b/>
-                <w:color w:val="767171" w:themeColor="background2" w:themeShade="80"/>
-              </w:rPr>
-              <w:t xml:space="preserve">(over </w:t>
-            </w:r>
-            <w:r>
-              <w:rPr>
-                <w:b/>
-                <w:color w:val="767171" w:themeColor="background2" w:themeShade="80"/>
-              </w:rPr>
-              <w:t xml:space="preserve">the </w:t>
-            </w:r>
-            <w:r>
-              <w:rPr>
-                <w:b/>
-                <w:color w:val="767171" w:themeColor="background2" w:themeShade="80"/>
-              </w:rPr>
-              <w:t>last 12 months)</w:t>
-            </w:r>
-          </w:p>
-          <w:p>
-            <w:pPr>
-              <w:rPr>
-                <w:b/>
-                <w:color w:val="767171" w:themeColor="background2" w:themeShade="80"/>
-              </w:rPr>
-            </w:pPr>
-          </w:p>
-          <w:p>
-            <w:pPr>
-              <w:rPr>
-                <w:b/>
-              </w:rPr>
-            </w:pPr>
-            <w:r>
-              <w:rPr>
-                <w:b/>
-              </w:rPr>
-              <w:t xml:space="preserve">{% </w:t>
-            </w:r>
-            <w:proofErr w:type="spellStart"/>
-            <w:r>
-              <w:rPr>
-                <w:b/>
-              </w:rPr>
-              <w:t>tr</w:t>
-            </w:r>
-            <w:proofErr w:type="spellEnd"/>
-            <w:r>
-              <w:rPr>
-                <w:b/>
-              </w:rPr>
-              <w:t xml:space="preserve"> for client in </w:t>
-            </w:r>
-            <w:proofErr w:type="spellStart"/>
-            <w:r>
-              <w:rPr>
-                <w:b/>
-              </w:rPr>
-              <w:t>non_publishable_clients</w:t>
-            </w:r>
-            <w:proofErr w:type="spellEnd"/>
-            <w:r>
-              <w:rPr>
-                <w:b/>
-              </w:rPr>
-              <w:t xml:space="preserve"> %}</w:t>
+            <w:r>
+              <w:t>Active key clients (over the last 12 months)</w:t>
+              <w:br/>
+              <w:br/>
+              <w:t>{% for client in non_publishable_clients %}</w:t>
             </w:r>
           </w:p>
         </w:tc>
@@ -4553,38 +4323,8 @@
             <w:shd w:val="clear" w:color="auto" w:fill="FDDFDF"/>
           </w:tcPr>
           <w:p>
-            <w:pPr>
-              <w:rPr>
-                <w:b/>
-                <w:sz w:val="28"/>
-                <w:szCs w:val="28"/>
-              </w:rPr>
-            </w:pPr>
-            <w:r>
-              <w:rPr>
-                <w:b/>
-                <w:sz w:val="28"/>
-                <w:szCs w:val="28"/>
-              </w:rPr>
-              <w:t xml:space="preserve">{{ </w:t>
-            </w:r>
-            <w:proofErr w:type="spellStart"/>
-            <w:r>
-              <w:rPr>
-                <w:b/>
-                <w:sz w:val="28"/>
-                <w:szCs w:val="28"/>
-              </w:rPr>
-              <w:t>client.is_new_client</w:t>
-            </w:r>
-            <w:proofErr w:type="spellEnd"/>
-            <w:r>
-              <w:rPr>
-                <w:b/>
-                <w:sz w:val="28"/>
-                <w:szCs w:val="28"/>
-              </w:rPr>
-              <w:t xml:space="preserve"> }</w:t>
+            <w:r>
+              <w:t>{{ client.is_new_client }}</w:t>
             </w:r>
           </w:p>
         </w:tc>
@@ -4852,56 +4592,8 @@
             <w:shd w:val="clear" w:color="auto" w:fill="FDDFDF"/>
           </w:tcPr>
           <w:p>
-            <w:pPr>
-              <w:rPr>
-                <w:b/>
-                <w:sz w:val="28"/>
-                <w:szCs w:val="28"/>
-              </w:rPr>
-            </w:pPr>
-            <w:r>
-              <w:rPr>
-                <w:b/>
-                <w:sz w:val="28"/>
-                <w:szCs w:val="28"/>
-              </w:rPr>
-              <w:t xml:space="preserve">{% </w:t>
-            </w:r>
-            <w:proofErr w:type="spellStart"/>
-            <w:r>
-              <w:rPr>
-                <w:b/>
-                <w:sz w:val="28"/>
-                <w:szCs w:val="28"/>
-              </w:rPr>
-              <w:t>tr</w:t>
-            </w:r>
-            <w:proofErr w:type="spellEnd"/>
-            <w:r>
-              <w:rPr>
-                <w:b/>
-                <w:sz w:val="28"/>
-                <w:szCs w:val="28"/>
-              </w:rPr>
-              <w:t xml:space="preserve"> </w:t>
-            </w:r>
-            <w:proofErr w:type="spellStart"/>
-            <w:r>
-              <w:rPr>
-                <w:b/>
-                <w:sz w:val="28"/>
-                <w:szCs w:val="28"/>
-              </w:rPr>
-              <w:t>endfor</w:t>
-            </w:r>
-            <w:proofErr w:type="spellEnd"/>
-            <w:r>
-              <w:rPr>
-                <w:b/>
-                <w:sz w:val="28"/>
-                <w:szCs w:val="28"/>
-              </w:rPr>
-              <w:t xml:space="preserve"> %}</w:t>
+            <w:r>
+              <w:t>{% endfor %}</w:t>
             </w:r>
           </w:p>
         </w:tc>
@@ -7872,63 +7564,10 @@
             <w:shd w:val="clear" w:color="auto" w:fill="D9D9D9" w:themeFill="background1" w:themeFillShade="D9"/>
           </w:tcPr>
           <w:p>
-            <w:pPr>
-              <w:rPr>
-                <w:b/>
-              </w:rPr>
-            </w:pPr>
-            <w:r>
-              <w:rPr>
-                <w:b/>
-              </w:rPr>
-              <w:t>Name</w:t>
-            </w:r>
-            <w:r>
-              <w:rPr>
-                <w:b/>
-              </w:rPr>
-              <w:t xml:space="preserve"> (English)</w:t>
-            </w:r>
-          </w:p>
-          <w:p>
-            <w:pPr>
-              <w:rPr>
-                <w:b/>
-              </w:rPr>
-            </w:pPr>
-            <w:r>
-              <w:rPr>
-                <w:b/>
-              </w:rPr>
-              <w:t xml:space="preserve">{% </w:t>
-            </w:r>
-            <w:proofErr w:type="spellStart"/>
-            <w:r>
-              <w:rPr>
-                <w:b/>
-              </w:rPr>
-              <w:t>tr</w:t>
-            </w:r>
-            <w:proofErr w:type="spellEnd"/>
-            <w:r>
-              <w:rPr>
-                <w:b/>
-              </w:rPr>
-              <w:t xml:space="preserve"> for team in </w:t>
-            </w:r>
-            <w:proofErr w:type="spellStart"/>
-            <w:r>
-              <w:rPr>
-                <w:b/>
-              </w:rPr>
-              <w:t>ArrivalDeparture</w:t>
-            </w:r>
-            <w:proofErr w:type="spellEnd"/>
-            <w:r>
-              <w:rPr>
-                <w:b/>
-              </w:rPr>
-              <w:t xml:space="preserve"> %}</w:t>
+            <w:r>
+              <w:t>Name (English)</w:t>
+              <w:br/>
+              <w:t>{% for team in ArrivalDeparture %}</w:t>
             </w:r>
           </w:p>
         </w:tc>
@@ -8955,56 +8594,8 @@
             <w:tcW w:w="1980" w:type="dxa"/>
           </w:tcPr>
           <w:p>
-            <w:pPr>
-              <w:rPr>
-                <w:b/>
-                <w:sz w:val="28"/>
-                <w:szCs w:val="28"/>
-              </w:rPr>
-            </w:pPr>
-            <w:r>
-              <w:rPr>
-                <w:b/>
-                <w:sz w:val="28"/>
-                <w:szCs w:val="28"/>
-              </w:rPr>
-              <w:t xml:space="preserve">{% </w:t>
-            </w:r>
-            <w:proofErr w:type="spellStart"/>
-            <w:r>
-              <w:rPr>
-                <w:b/>
-                <w:sz w:val="28"/>
-                <w:szCs w:val="28"/>
-              </w:rPr>
-              <w:t>tr</w:t>
-            </w:r>
-            <w:proofErr w:type="spellEnd"/>
-            <w:r>
-              <w:rPr>
-                <w:b/>
-                <w:sz w:val="28"/>
-                <w:szCs w:val="28"/>
-              </w:rPr>
-              <w:t xml:space="preserve"> </w:t>
-            </w:r>
-            <w:proofErr w:type="spellStart"/>
-            <w:r>
-              <w:rPr>
-                <w:b/>
-                <w:sz w:val="28"/>
-                <w:szCs w:val="28"/>
-              </w:rPr>
-              <w:t>endfor</w:t>
-            </w:r>
-            <w:proofErr w:type="spellEnd"/>
-            <w:r>
-              <w:rPr>
-                <w:b/>
-                <w:sz w:val="28"/>
-                <w:szCs w:val="28"/>
-              </w:rPr>
-              <w:t xml:space="preserve"> %}</w:t>
+            <w:r>
+              <w:t>{% endfor %}</w:t>
             </w:r>
           </w:p>
         </w:tc>
@@ -9775,15 +9366,7 @@
         </w:rPr>
       </w:pPr>
       <w:r>
-        <w:t xml:space="preserve">{% p for matter in </w:t>
-      </w:r>
-      <w:proofErr w:type="spellStart"/>
-      <w:r>
-        <w:t>publishable_matters</w:t>
-      </w:r>
-      <w:proofErr w:type="spellEnd"/>
-      <w:r>
-        <w:t xml:space="preserve"> %}</w:t>
+        <w:t>{% for matter in publishable_matters %}</w:t>
       </w:r>
     </w:p>
     <w:tbl>
@@ -10379,46 +9962,8 @@
             <w:shd w:val="clear" w:color="auto" w:fill="E2EFD9" w:themeFill="accent6" w:themeFillTint="33"/>
           </w:tcPr>
           <w:p>
-            <w:pPr>
-              <w:rPr>
-                <w:b/>
-                <w:sz w:val="28"/>
-                <w:szCs w:val="28"/>
-              </w:rPr>
-            </w:pPr>
-            <w:r>
-              <w:rPr>
-                <w:b/>
-                <w:sz w:val="28"/>
-                <w:szCs w:val="28"/>
-              </w:rPr>
-              <w:t xml:space="preserve">{{ </w:t>
-            </w:r>
-            <w:proofErr w:type="spellStart"/>
-            <w:r>
-              <w:rPr>
-                <w:b/>
-                <w:sz w:val="28"/>
-                <w:szCs w:val="28"/>
-              </w:rPr>
-              <w:t>matter.lead_partners</w:t>
-            </w:r>
-            <w:proofErr w:type="spellEnd"/>
-            <w:r>
-              <w:rPr>
-                <w:b/>
-                <w:sz w:val="28"/>
-                <w:szCs w:val="28"/>
-              </w:rPr>
-              <w:t>[0].name</w:t>
-            </w:r>
-            <w:r>
-              <w:rPr>
-                <w:b/>
-                <w:sz w:val="28"/>
-                <w:szCs w:val="28"/>
-              </w:rPr>
-              <w:t xml:space="preserve"> }}</w:t>
+            <w:r>
+              <w:t>{{ matter.leading_partners[0].name }}</w:t>
             </w:r>
           </w:p>
         </w:tc>
@@ -10429,46 +9974,8 @@
             <w:shd w:val="clear" w:color="auto" w:fill="E2EFD9" w:themeFill="accent6" w:themeFillTint="33"/>
           </w:tcPr>
           <w:p>
-            <w:pPr>
-              <w:rPr>
-                <w:b/>
-                <w:sz w:val="28"/>
-                <w:szCs w:val="28"/>
-              </w:rPr>
-            </w:pPr>
-            <w:r>
-              <w:rPr>
-                <w:b/>
-                <w:sz w:val="28"/>
-                <w:szCs w:val="28"/>
-              </w:rPr>
-              <w:t xml:space="preserve">{{ </w:t>
-            </w:r>
-            <w:proofErr w:type="spellStart"/>
-            <w:r>
-              <w:rPr>
-                <w:b/>
-                <w:sz w:val="28"/>
-                <w:szCs w:val="28"/>
-              </w:rPr>
-              <w:t>matter.lead_partners</w:t>
-            </w:r>
-            <w:proofErr w:type="spellEnd"/>
-            <w:r>
-              <w:rPr>
-                <w:b/>
-                <w:sz w:val="28"/>
-                <w:szCs w:val="28"/>
-              </w:rPr>
-              <w:t>[0].office</w:t>
-            </w:r>
-            <w:r>
-              <w:rPr>
-                <w:b/>
-                <w:sz w:val="28"/>
-                <w:szCs w:val="28"/>
-              </w:rPr>
-              <w:t xml:space="preserve"> }}</w:t>
+            <w:r>
+              <w:t>{{ matter.leading_partners[0].office }}</w:t>
             </w:r>
           </w:p>
         </w:tc>
@@ -10478,56 +9985,8 @@
             <w:shd w:val="clear" w:color="auto" w:fill="E2EFD9" w:themeFill="accent6" w:themeFillTint="33"/>
           </w:tcPr>
           <w:p>
-            <w:pPr>
-              <w:rPr>
-                <w:b/>
-                <w:sz w:val="28"/>
-                <w:szCs w:val="28"/>
-              </w:rPr>
-            </w:pPr>
-            <w:r>
-              <w:rPr>
-                <w:b/>
-                <w:sz w:val="28"/>
-                <w:szCs w:val="28"/>
-              </w:rPr>
-              <w:t xml:space="preserve">{{ </w:t>
-            </w:r>
-            <w:proofErr w:type="spellStart"/>
-            <w:r>
-              <w:rPr>
-                <w:b/>
-                <w:sz w:val="28"/>
-                <w:szCs w:val="28"/>
-              </w:rPr>
-              <w:t>matter.lead_partners</w:t>
-            </w:r>
-            <w:proofErr w:type="spellEnd"/>
-            <w:r>
-              <w:rPr>
-                <w:b/>
-                <w:sz w:val="28"/>
-                <w:szCs w:val="28"/>
-              </w:rPr>
-              <w:t>[0].</w:t>
-            </w:r>
-            <w:proofErr w:type="spellStart"/>
-            <w:r>
-              <w:rPr>
-                <w:b/>
-                <w:sz w:val="28"/>
-                <w:szCs w:val="28"/>
-              </w:rPr>
-              <w:t>practice_area</w:t>
-            </w:r>
-            <w:proofErr w:type="spellEnd"/>
-            <w:r>
-              <w:rPr>
-                <w:b/>
-                <w:sz w:val="28"/>
-                <w:szCs w:val="28"/>
-              </w:rPr>
-              <w:t xml:space="preserve"> }}</w:t>
+            <w:r>
+              <w:t>{{ matter.leading_partners[0].practice_area }}</w:t>
             </w:r>
           </w:p>
         </w:tc>
@@ -10543,46 +10002,8 @@
             <w:shd w:val="clear" w:color="auto" w:fill="E2EFD9" w:themeFill="accent6" w:themeFillTint="33"/>
           </w:tcPr>
           <w:p>
-            <w:pPr>
-              <w:rPr>
-                <w:b/>
-                <w:sz w:val="28"/>
-                <w:szCs w:val="28"/>
-              </w:rPr>
-            </w:pPr>
-            <w:r>
-              <w:rPr>
-                <w:b/>
-                <w:sz w:val="28"/>
-                <w:szCs w:val="28"/>
-              </w:rPr>
-              <w:t xml:space="preserve">{{ </w:t>
-            </w:r>
-            <w:proofErr w:type="spellStart"/>
-            <w:r>
-              <w:rPr>
-                <w:b/>
-                <w:sz w:val="28"/>
-                <w:szCs w:val="28"/>
-              </w:rPr>
-              <w:t>matter.lead_partners</w:t>
-            </w:r>
-            <w:proofErr w:type="spellEnd"/>
-            <w:r>
-              <w:rPr>
-                <w:b/>
-                <w:sz w:val="28"/>
-                <w:szCs w:val="28"/>
-              </w:rPr>
-              <w:t>[1].name</w:t>
-            </w:r>
-            <w:r>
-              <w:rPr>
-                <w:b/>
-                <w:sz w:val="28"/>
-                <w:szCs w:val="28"/>
-              </w:rPr>
-              <w:t xml:space="preserve"> }}</w:t>
+            <w:r>
+              <w:t>{{ matter.leading_partners[1].name }}</w:t>
             </w:r>
           </w:p>
         </w:tc>
@@ -10596,46 +10017,8 @@
             <w:shd w:val="clear" w:color="auto" w:fill="E2EFD9" w:themeFill="accent6" w:themeFillTint="33"/>
           </w:tcPr>
           <w:p>
-            <w:pPr>
-              <w:rPr>
-                <w:b/>
-                <w:sz w:val="28"/>
-                <w:szCs w:val="28"/>
-              </w:rPr>
-            </w:pPr>
-            <w:r>
-              <w:rPr>
-                <w:b/>
-                <w:sz w:val="28"/>
-                <w:szCs w:val="28"/>
-              </w:rPr>
-              <w:t xml:space="preserve">{{ </w:t>
-            </w:r>
-            <w:proofErr w:type="spellStart"/>
-            <w:r>
-              <w:rPr>
-                <w:b/>
-                <w:sz w:val="28"/>
-                <w:szCs w:val="28"/>
-              </w:rPr>
-              <w:t>matter.lead_partners</w:t>
-            </w:r>
-            <w:proofErr w:type="spellEnd"/>
-            <w:r>
-              <w:rPr>
-                <w:b/>
-                <w:sz w:val="28"/>
-                <w:szCs w:val="28"/>
-              </w:rPr>
-              <w:t>[1].office</w:t>
-            </w:r>
-            <w:r>
-              <w:rPr>
-                <w:b/>
-                <w:sz w:val="28"/>
-                <w:szCs w:val="28"/>
-              </w:rPr>
-              <w:t xml:space="preserve"> }}</w:t>
+            <w:r>
+              <w:t>{{ matter.leading_partners[1].office }}</w:t>
             </w:r>
           </w:p>
         </w:tc>
@@ -10648,56 +10031,8 @@
             <w:shd w:val="clear" w:color="auto" w:fill="E2EFD9" w:themeFill="accent6" w:themeFillTint="33"/>
           </w:tcPr>
           <w:p>
-            <w:pPr>
-              <w:rPr>
-                <w:b/>
-                <w:sz w:val="28"/>
-                <w:szCs w:val="28"/>
-              </w:rPr>
-            </w:pPr>
-            <w:r>
-              <w:rPr>
-                <w:b/>
-                <w:sz w:val="28"/>
-                <w:szCs w:val="28"/>
-              </w:rPr>
-              <w:t xml:space="preserve">{{ </w:t>
-            </w:r>
-            <w:proofErr w:type="spellStart"/>
-            <w:r>
-              <w:rPr>
-                <w:b/>
-                <w:sz w:val="28"/>
-                <w:szCs w:val="28"/>
-              </w:rPr>
-              <w:t>matter.lead_partners</w:t>
-            </w:r>
-            <w:proofErr w:type="spellEnd"/>
-            <w:r>
-              <w:rPr>
-                <w:b/>
-                <w:sz w:val="28"/>
-                <w:szCs w:val="28"/>
-              </w:rPr>
-              <w:t>[1].</w:t>
-            </w:r>
-            <w:proofErr w:type="spellStart"/>
-            <w:r>
-              <w:rPr>
-                <w:b/>
-                <w:sz w:val="28"/>
-                <w:szCs w:val="28"/>
-              </w:rPr>
-              <w:t>practice_area</w:t>
-            </w:r>
-            <w:proofErr w:type="spellEnd"/>
-            <w:r>
-              <w:rPr>
-                <w:b/>
-                <w:sz w:val="28"/>
-                <w:szCs w:val="28"/>
-              </w:rPr>
-              <w:t xml:space="preserve"> }}</w:t>
+            <w:r>
+              <w:t>{{ matter.leading_partners[1].practice_area }}</w:t>
             </w:r>
           </w:p>
         </w:tc>
@@ -10815,46 +10150,8 @@
             <w:shd w:val="clear" w:color="auto" w:fill="E2EFD9" w:themeFill="accent6" w:themeFillTint="33"/>
           </w:tcPr>
           <w:p>
-            <w:pPr>
-              <w:rPr>
-                <w:b/>
-                <w:sz w:val="28"/>
-                <w:szCs w:val="28"/>
-              </w:rPr>
-            </w:pPr>
-            <w:r>
-              <w:rPr>
-                <w:b/>
-                <w:sz w:val="28"/>
-                <w:szCs w:val="28"/>
-              </w:rPr>
-              <w:t xml:space="preserve">{{ </w:t>
-            </w:r>
-            <w:proofErr w:type="spellStart"/>
-            <w:r>
-              <w:rPr>
-                <w:b/>
-                <w:sz w:val="28"/>
-                <w:szCs w:val="28"/>
-              </w:rPr>
-              <w:t>matter.other_key_team_members</w:t>
-            </w:r>
-            <w:proofErr w:type="spellEnd"/>
-            <w:r>
-              <w:rPr>
-                <w:b/>
-                <w:sz w:val="28"/>
-                <w:szCs w:val="28"/>
-              </w:rPr>
-              <w:t>[0].name</w:t>
-            </w:r>
-            <w:r>
-              <w:rPr>
-                <w:b/>
-                <w:sz w:val="28"/>
-                <w:szCs w:val="28"/>
-              </w:rPr>
-              <w:t xml:space="preserve"> }}</w:t>
+            <w:r>
+              <w:t>{{ matter.other_partners[0].name }}</w:t>
             </w:r>
           </w:p>
         </w:tc>
@@ -10865,46 +10162,8 @@
             <w:shd w:val="clear" w:color="auto" w:fill="E2EFD9" w:themeFill="accent6" w:themeFillTint="33"/>
           </w:tcPr>
           <w:p>
-            <w:pPr>
-              <w:rPr>
-                <w:b/>
-                <w:sz w:val="28"/>
-                <w:szCs w:val="28"/>
-              </w:rPr>
-            </w:pPr>
-            <w:r>
-              <w:rPr>
-                <w:b/>
-                <w:sz w:val="28"/>
-                <w:szCs w:val="28"/>
-              </w:rPr>
-              <w:t xml:space="preserve">{{ </w:t>
-            </w:r>
-            <w:proofErr w:type="spellStart"/>
-            <w:r>
-              <w:rPr>
-                <w:b/>
-                <w:sz w:val="28"/>
-                <w:szCs w:val="28"/>
-              </w:rPr>
-              <w:t>matter.other_key_team_members</w:t>
-            </w:r>
-            <w:proofErr w:type="spellEnd"/>
-            <w:r>
-              <w:rPr>
-                <w:b/>
-                <w:sz w:val="28"/>
-                <w:szCs w:val="28"/>
-              </w:rPr>
-              <w:t>[0].office</w:t>
-            </w:r>
-            <w:r>
-              <w:rPr>
-                <w:b/>
-                <w:sz w:val="28"/>
-                <w:szCs w:val="28"/>
-              </w:rPr>
-              <w:t xml:space="preserve"> }}</w:t>
+            <w:r>
+              <w:t>{{ matter.other_partners[0].office }}</w:t>
             </w:r>
           </w:p>
         </w:tc>
@@ -10914,56 +10173,8 @@
             <w:shd w:val="clear" w:color="auto" w:fill="E2EFD9" w:themeFill="accent6" w:themeFillTint="33"/>
           </w:tcPr>
           <w:p>
-            <w:pPr>
-              <w:rPr>
-                <w:b/>
-                <w:sz w:val="28"/>
-                <w:szCs w:val="28"/>
-              </w:rPr>
-            </w:pPr>
-            <w:r>
-              <w:rPr>
-                <w:b/>
-                <w:sz w:val="28"/>
-                <w:szCs w:val="28"/>
-              </w:rPr>
-              <w:t xml:space="preserve">{{ </w:t>
-            </w:r>
-            <w:proofErr w:type="spellStart"/>
-            <w:r>
-              <w:rPr>
-                <w:b/>
-                <w:sz w:val="28"/>
-                <w:szCs w:val="28"/>
-              </w:rPr>
-              <w:t>matter.other_key_team_members</w:t>
-            </w:r>
-            <w:proofErr w:type="spellEnd"/>
-            <w:r>
-              <w:rPr>
-                <w:b/>
-                <w:sz w:val="28"/>
-                <w:szCs w:val="28"/>
-              </w:rPr>
-              <w:t>[0].</w:t>
-            </w:r>
-            <w:proofErr w:type="spellStart"/>
-            <w:r>
-              <w:rPr>
-                <w:b/>
-                <w:sz w:val="28"/>
-                <w:szCs w:val="28"/>
-              </w:rPr>
-              <w:t>practice_area</w:t>
-            </w:r>
-            <w:proofErr w:type="spellEnd"/>
-            <w:r>
-              <w:rPr>
-                <w:b/>
-                <w:sz w:val="28"/>
-                <w:szCs w:val="28"/>
-              </w:rPr>
-              <w:t xml:space="preserve"> }}</w:t>
+            <w:r>
+              <w:t>{{ matter.other_partners[0].practice_area }}</w:t>
             </w:r>
           </w:p>
         </w:tc>
@@ -10979,55 +10190,8 @@
             <w:shd w:val="clear" w:color="auto" w:fill="E2EFD9" w:themeFill="accent6" w:themeFillTint="33"/>
           </w:tcPr>
           <w:p>
-            <w:pPr>
-              <w:rPr>
-                <w:b/>
-                <w:sz w:val="28"/>
-                <w:szCs w:val="28"/>
-              </w:rPr>
-            </w:pPr>
-            <w:r>
-              <w:rPr>
-                <w:b/>
-                <w:sz w:val="28"/>
-                <w:szCs w:val="28"/>
-              </w:rPr>
-              <w:t xml:space="preserve">{{ </w:t>
-            </w:r>
-            <w:proofErr w:type="spellStart"/>
-            <w:r>
-              <w:rPr>
-                <w:b/>
-                <w:sz w:val="28"/>
-                <w:szCs w:val="28"/>
-              </w:rPr>
-              <w:t>matter.other_key_tea</w:t>
-            </w:r>
-            <w:r>
-              <w:rPr>
-                <w:b/>
-                <w:sz w:val="28"/>
-                <w:szCs w:val="28"/>
-              </w:rPr>
-              <w:lastRenderedPageBreak/>
-              <w:t>m_members</w:t>
-            </w:r>
-            <w:proofErr w:type="spellEnd"/>
-            <w:r>
-              <w:rPr>
-                <w:b/>
-                <w:sz w:val="28"/>
-                <w:szCs w:val="28"/>
-              </w:rPr>
-              <w:t>[1].name</w:t>
-            </w:r>
-            <w:r>
-              <w:rPr>
-                <w:b/>
-                <w:sz w:val="28"/>
-                <w:szCs w:val="28"/>
-              </w:rPr>
-              <w:t xml:space="preserve"> }}</w:t>
+            <w:r>
+              <w:t>{{ matter.other_partners[1].name }}</w:t>
             </w:r>
           </w:p>
         </w:tc>
@@ -11041,56 +10205,8 @@
             <w:shd w:val="clear" w:color="auto" w:fill="E2EFD9" w:themeFill="accent6" w:themeFillTint="33"/>
           </w:tcPr>
           <w:p>
-            <w:pPr>
-              <w:rPr>
-                <w:b/>
-                <w:sz w:val="28"/>
-                <w:szCs w:val="28"/>
-              </w:rPr>
-            </w:pPr>
-            <w:r>
-              <w:rPr>
-                <w:b/>
-                <w:sz w:val="28"/>
-                <w:szCs w:val="28"/>
-              </w:rPr>
-              <w:lastRenderedPageBreak/>
-              <w:t xml:space="preserve">{{ </w:t>
-            </w:r>
-            <w:proofErr w:type="spellStart"/>
-            <w:r>
-              <w:rPr>
-                <w:b/>
-                <w:sz w:val="28"/>
-                <w:szCs w:val="28"/>
-              </w:rPr>
-              <w:t>matter.other_key_tea</w:t>
-            </w:r>
-            <w:r>
-              <w:rPr>
-                <w:b/>
-                <w:sz w:val="28"/>
-                <w:szCs w:val="28"/>
-              </w:rPr>
-              <w:lastRenderedPageBreak/>
-              <w:t>m_members</w:t>
-            </w:r>
-            <w:proofErr w:type="spellEnd"/>
-            <w:r>
-              <w:rPr>
-                <w:b/>
-                <w:sz w:val="28"/>
-                <w:szCs w:val="28"/>
-              </w:rPr>
-              <w:t>[1].office</w:t>
-            </w:r>
-            <w:r>
-              <w:rPr>
-                <w:b/>
-                <w:sz w:val="28"/>
-                <w:szCs w:val="28"/>
-              </w:rPr>
-              <w:t xml:space="preserve"> }}</w:t>
+            <w:r>
+              <w:t>{{ matter.other_partners[1].office }}</w:t>
             </w:r>
           </w:p>
         </w:tc>
@@ -11103,66 +10219,8 @@
             <w:shd w:val="clear" w:color="auto" w:fill="E2EFD9" w:themeFill="accent6" w:themeFillTint="33"/>
           </w:tcPr>
           <w:p>
-            <w:pPr>
-              <w:rPr>
-                <w:b/>
-                <w:sz w:val="28"/>
-                <w:szCs w:val="28"/>
-              </w:rPr>
-            </w:pPr>
-            <w:r>
-              <w:rPr>
-                <w:b/>
-                <w:sz w:val="28"/>
-                <w:szCs w:val="28"/>
-              </w:rPr>
-              <w:lastRenderedPageBreak/>
-              <w:t xml:space="preserve">{{ </w:t>
-            </w:r>
-            <w:proofErr w:type="spellStart"/>
-            <w:r>
-              <w:rPr>
-                <w:b/>
-                <w:sz w:val="28"/>
-                <w:szCs w:val="28"/>
-              </w:rPr>
-              <w:t>matter.other_key_team</w:t>
-            </w:r>
-            <w:r>
-              <w:rPr>
-                <w:b/>
-                <w:sz w:val="28"/>
-                <w:szCs w:val="28"/>
-              </w:rPr>
-              <w:lastRenderedPageBreak/>
-              <w:t>_members</w:t>
-            </w:r>
-            <w:proofErr w:type="spellEnd"/>
-            <w:r>
-              <w:rPr>
-                <w:b/>
-                <w:sz w:val="28"/>
-                <w:szCs w:val="28"/>
-              </w:rPr>
-              <w:t>[1].</w:t>
-            </w:r>
-            <w:proofErr w:type="spellStart"/>
-            <w:r>
-              <w:rPr>
-                <w:b/>
-                <w:sz w:val="28"/>
-                <w:szCs w:val="28"/>
-              </w:rPr>
-              <w:t>practice_area</w:t>
-            </w:r>
-            <w:proofErr w:type="spellEnd"/>
-            <w:r>
-              <w:rPr>
-                <w:b/>
-                <w:sz w:val="28"/>
-                <w:szCs w:val="28"/>
-              </w:rPr>
-              <w:t xml:space="preserve"> }}</w:t>
+            <w:r>
+              <w:t>{{ matter.other_partners[1].practice_area }}</w:t>
             </w:r>
           </w:p>
         </w:tc>
@@ -11636,30 +10694,7 @@
         </w:rPr>
       </w:pPr>
       <w:r>
-        <w:rPr>
-          <w:b/>
-          <w:sz w:val="28"/>
-          <w:szCs w:val="28"/>
-        </w:rPr>
-        <w:t xml:space="preserve">{% p </w:t>
-      </w:r>
-      <w:proofErr w:type="spellStart"/>
-      <w:r>
-        <w:rPr>
-          <w:b/>
-          <w:sz w:val="28"/>
-          <w:szCs w:val="28"/>
-        </w:rPr>
-        <w:t>endfor</w:t>
-      </w:r>
-      <w:proofErr w:type="spellEnd"/>
-      <w:r>
-        <w:rPr>
-          <w:b/>
-          <w:sz w:val="28"/>
-          <w:szCs w:val="28"/>
-        </w:rPr>
-        <w:t xml:space="preserve"> %}</w:t>
+        <w:t>{% endfor %}</w:t>
       </w:r>
     </w:p>
     <w:p>
@@ -11671,30 +10706,7 @@
         </w:rPr>
       </w:pPr>
       <w:r>
-        <w:rPr>
-          <w:b/>
-          <w:sz w:val="28"/>
-          <w:szCs w:val="28"/>
-        </w:rPr>
-        <w:t xml:space="preserve">{% p for matter in </w:t>
-      </w:r>
-      <w:proofErr w:type="spellStart"/>
-      <w:r>
-        <w:rPr>
-          <w:b/>
-          <w:sz w:val="28"/>
-          <w:szCs w:val="28"/>
-        </w:rPr>
-        <w:t>non_publishable_matters</w:t>
-      </w:r>
-      <w:proofErr w:type="spellEnd"/>
-      <w:r>
-        <w:rPr>
-          <w:b/>
-          <w:sz w:val="28"/>
-          <w:szCs w:val="28"/>
-        </w:rPr>
-        <w:t xml:space="preserve"> %}</w:t>
+        <w:t>{% for matter in non_publishable_matters %}</w:t>
       </w:r>
     </w:p>
     <w:p>
@@ -12302,46 +11314,8 @@
             <w:shd w:val="clear" w:color="auto" w:fill="FDDFDF"/>
           </w:tcPr>
           <w:p>
-            <w:pPr>
-              <w:rPr>
-                <w:b/>
-                <w:sz w:val="28"/>
-                <w:szCs w:val="28"/>
-              </w:rPr>
-            </w:pPr>
-            <w:r>
-              <w:rPr>
-                <w:b/>
-                <w:sz w:val="28"/>
-                <w:szCs w:val="28"/>
-              </w:rPr>
-              <w:t xml:space="preserve">{{ </w:t>
-            </w:r>
-            <w:proofErr w:type="spellStart"/>
-            <w:r>
-              <w:rPr>
-                <w:b/>
-                <w:sz w:val="28"/>
-                <w:szCs w:val="28"/>
-              </w:rPr>
-              <w:t>matter.lead_partners</w:t>
-            </w:r>
-            <w:proofErr w:type="spellEnd"/>
-            <w:r>
-              <w:rPr>
-                <w:b/>
-                <w:sz w:val="28"/>
-                <w:szCs w:val="28"/>
-              </w:rPr>
-              <w:t>[0].name</w:t>
-            </w:r>
-            <w:r>
-              <w:rPr>
-                <w:b/>
-                <w:sz w:val="28"/>
-                <w:szCs w:val="28"/>
-              </w:rPr>
-              <w:t xml:space="preserve"> }}</w:t>
+            <w:r>
+              <w:t>{{ matter.leading_partners[0].name }}</w:t>
             </w:r>
           </w:p>
         </w:tc>
@@ -12352,46 +11326,8 @@
             <w:shd w:val="clear" w:color="auto" w:fill="FDDFDF"/>
           </w:tcPr>
           <w:p>
-            <w:pPr>
-              <w:rPr>
-                <w:b/>
-                <w:sz w:val="28"/>
-                <w:szCs w:val="28"/>
-              </w:rPr>
-            </w:pPr>
-            <w:r>
-              <w:rPr>
-                <w:b/>
-                <w:sz w:val="28"/>
-                <w:szCs w:val="28"/>
-              </w:rPr>
-              <w:t xml:space="preserve">{{ </w:t>
-            </w:r>
-            <w:proofErr w:type="spellStart"/>
-            <w:r>
-              <w:rPr>
-                <w:b/>
-                <w:sz w:val="28"/>
-                <w:szCs w:val="28"/>
-              </w:rPr>
-              <w:t>matter.lead_partners</w:t>
-            </w:r>
-            <w:proofErr w:type="spellEnd"/>
-            <w:r>
-              <w:rPr>
-                <w:b/>
-                <w:sz w:val="28"/>
-                <w:szCs w:val="28"/>
-              </w:rPr>
-              <w:t>[0].office</w:t>
-            </w:r>
-            <w:r>
-              <w:rPr>
-                <w:b/>
-                <w:sz w:val="28"/>
-                <w:szCs w:val="28"/>
-              </w:rPr>
-              <w:t xml:space="preserve"> }}</w:t>
+            <w:r>
+              <w:t>{{ matter.leading_partners[0].office }}</w:t>
             </w:r>
           </w:p>
         </w:tc>
@@ -12401,56 +11337,8 @@
             <w:shd w:val="clear" w:color="auto" w:fill="FDDFDF"/>
           </w:tcPr>
           <w:p>
-            <w:pPr>
-              <w:rPr>
-                <w:b/>
-                <w:sz w:val="28"/>
-                <w:szCs w:val="28"/>
-              </w:rPr>
-            </w:pPr>
-            <w:r>
-              <w:rPr>
-                <w:b/>
-                <w:sz w:val="28"/>
-                <w:szCs w:val="28"/>
-              </w:rPr>
-              <w:t xml:space="preserve">{{ </w:t>
-            </w:r>
-            <w:proofErr w:type="spellStart"/>
-            <w:r>
-              <w:rPr>
-                <w:b/>
-                <w:sz w:val="28"/>
-                <w:szCs w:val="28"/>
-              </w:rPr>
-              <w:t>matter.lead_partners</w:t>
-            </w:r>
-            <w:proofErr w:type="spellEnd"/>
-            <w:r>
-              <w:rPr>
-                <w:b/>
-                <w:sz w:val="28"/>
-                <w:szCs w:val="28"/>
-              </w:rPr>
-              <w:t>[0].</w:t>
-            </w:r>
-            <w:proofErr w:type="spellStart"/>
-            <w:r>
-              <w:rPr>
-                <w:b/>
-                <w:sz w:val="28"/>
-                <w:szCs w:val="28"/>
-              </w:rPr>
-              <w:t>practice_area</w:t>
-            </w:r>
-            <w:proofErr w:type="spellEnd"/>
-            <w:r>
-              <w:rPr>
-                <w:b/>
-                <w:sz w:val="28"/>
-                <w:szCs w:val="28"/>
-              </w:rPr>
-              <w:t xml:space="preserve"> }}</w:t>
+            <w:r>
+              <w:t>{{ matter.leading_partners[0].practice_area }}</w:t>
             </w:r>
           </w:p>
         </w:tc>
@@ -12466,46 +11354,8 @@
             <w:shd w:val="clear" w:color="auto" w:fill="FDDFDF"/>
           </w:tcPr>
           <w:p>
-            <w:pPr>
-              <w:rPr>
-                <w:b/>
-                <w:sz w:val="28"/>
-                <w:szCs w:val="28"/>
-              </w:rPr>
-            </w:pPr>
-            <w:r>
-              <w:rPr>
-                <w:b/>
-                <w:sz w:val="28"/>
-                <w:szCs w:val="28"/>
-              </w:rPr>
-              <w:t xml:space="preserve">{{ </w:t>
-            </w:r>
-            <w:proofErr w:type="spellStart"/>
-            <w:r>
-              <w:rPr>
-                <w:b/>
-                <w:sz w:val="28"/>
-                <w:szCs w:val="28"/>
-              </w:rPr>
-              <w:t>matter.lead_partners</w:t>
-            </w:r>
-            <w:proofErr w:type="spellEnd"/>
-            <w:r>
-              <w:rPr>
-                <w:b/>
-                <w:sz w:val="28"/>
-                <w:szCs w:val="28"/>
-              </w:rPr>
-              <w:t>[1].name</w:t>
-            </w:r>
-            <w:r>
-              <w:rPr>
-                <w:b/>
-                <w:sz w:val="28"/>
-                <w:szCs w:val="28"/>
-              </w:rPr>
-              <w:t xml:space="preserve"> }}</w:t>
+            <w:r>
+              <w:t>{{ matter.leading_partners[1].name }}</w:t>
             </w:r>
           </w:p>
         </w:tc>
@@ -12519,46 +11369,8 @@
             <w:shd w:val="clear" w:color="auto" w:fill="FDDFDF"/>
           </w:tcPr>
           <w:p>
-            <w:pPr>
-              <w:rPr>
-                <w:b/>
-                <w:sz w:val="28"/>
-                <w:szCs w:val="28"/>
-              </w:rPr>
-            </w:pPr>
-            <w:r>
-              <w:rPr>
-                <w:b/>
-                <w:sz w:val="28"/>
-                <w:szCs w:val="28"/>
-              </w:rPr>
-              <w:t xml:space="preserve">{{ </w:t>
-            </w:r>
-            <w:proofErr w:type="spellStart"/>
-            <w:r>
-              <w:rPr>
-                <w:b/>
-                <w:sz w:val="28"/>
-                <w:szCs w:val="28"/>
-              </w:rPr>
-              <w:t>matter.lead_partners</w:t>
-            </w:r>
-            <w:proofErr w:type="spellEnd"/>
-            <w:r>
-              <w:rPr>
-                <w:b/>
-                <w:sz w:val="28"/>
-                <w:szCs w:val="28"/>
-              </w:rPr>
-              <w:t>[1].office</w:t>
-            </w:r>
-            <w:r>
-              <w:rPr>
-                <w:b/>
-                <w:sz w:val="28"/>
-                <w:szCs w:val="28"/>
-              </w:rPr>
-              <w:t xml:space="preserve"> }}</w:t>
+            <w:r>
+              <w:t>{{ matter.leading_partners[1].office }}</w:t>
             </w:r>
           </w:p>
         </w:tc>
@@ -12571,56 +11383,8 @@
             <w:shd w:val="clear" w:color="auto" w:fill="FDDFDF"/>
           </w:tcPr>
           <w:p>
-            <w:pPr>
-              <w:rPr>
-                <w:b/>
-                <w:sz w:val="28"/>
-                <w:szCs w:val="28"/>
-              </w:rPr>
-            </w:pPr>
-            <w:r>
-              <w:rPr>
-                <w:b/>
-                <w:sz w:val="28"/>
-                <w:szCs w:val="28"/>
-              </w:rPr>
-              <w:t xml:space="preserve">{{ </w:t>
-            </w:r>
-            <w:proofErr w:type="spellStart"/>
-            <w:r>
-              <w:rPr>
-                <w:b/>
-                <w:sz w:val="28"/>
-                <w:szCs w:val="28"/>
-              </w:rPr>
-              <w:t>matter.lead_partners</w:t>
-            </w:r>
-            <w:proofErr w:type="spellEnd"/>
-            <w:r>
-              <w:rPr>
-                <w:b/>
-                <w:sz w:val="28"/>
-                <w:szCs w:val="28"/>
-              </w:rPr>
-              <w:t>[1].</w:t>
-            </w:r>
-            <w:proofErr w:type="spellStart"/>
-            <w:r>
-              <w:rPr>
-                <w:b/>
-                <w:sz w:val="28"/>
-                <w:szCs w:val="28"/>
-              </w:rPr>
-              <w:t>practice_area</w:t>
-            </w:r>
-            <w:proofErr w:type="spellEnd"/>
-            <w:r>
-              <w:rPr>
-                <w:b/>
-                <w:sz w:val="28"/>
-                <w:szCs w:val="28"/>
-              </w:rPr>
-              <w:t xml:space="preserve"> }}</w:t>
+            <w:r>
+              <w:t>{{ matter.leading_partners[1].practice_area }}</w:t>
             </w:r>
           </w:p>
         </w:tc>
@@ -12738,46 +11502,8 @@
             <w:shd w:val="clear" w:color="auto" w:fill="FDDFDF"/>
           </w:tcPr>
           <w:p>
-            <w:pPr>
-              <w:rPr>
-                <w:b/>
-                <w:sz w:val="28"/>
-                <w:szCs w:val="28"/>
-              </w:rPr>
-            </w:pPr>
-            <w:r>
-              <w:rPr>
-                <w:b/>
-                <w:sz w:val="28"/>
-                <w:szCs w:val="28"/>
-              </w:rPr>
-              <w:t xml:space="preserve">{{ </w:t>
-            </w:r>
-            <w:proofErr w:type="spellStart"/>
-            <w:r>
-              <w:rPr>
-                <w:b/>
-                <w:sz w:val="28"/>
-                <w:szCs w:val="28"/>
-              </w:rPr>
-              <w:t>matter.other_key_team_members</w:t>
-            </w:r>
-            <w:proofErr w:type="spellEnd"/>
-            <w:r>
-              <w:rPr>
-                <w:b/>
-                <w:sz w:val="28"/>
-                <w:szCs w:val="28"/>
-              </w:rPr>
-              <w:t>[0].name</w:t>
-            </w:r>
-            <w:r>
-              <w:rPr>
-                <w:b/>
-                <w:sz w:val="28"/>
-                <w:szCs w:val="28"/>
-              </w:rPr>
-              <w:t xml:space="preserve"> }}</w:t>
+            <w:r>
+              <w:t>{{ matter.other_partners[0].name }}</w:t>
             </w:r>
           </w:p>
         </w:tc>
@@ -12788,46 +11514,8 @@
             <w:shd w:val="clear" w:color="auto" w:fill="FDDFDF"/>
           </w:tcPr>
           <w:p>
-            <w:pPr>
-              <w:rPr>
-                <w:b/>
-                <w:sz w:val="28"/>
-                <w:szCs w:val="28"/>
-              </w:rPr>
-            </w:pPr>
-            <w:r>
-              <w:rPr>
-                <w:b/>
-                <w:sz w:val="28"/>
-                <w:szCs w:val="28"/>
-              </w:rPr>
-              <w:t xml:space="preserve">{{ </w:t>
-            </w:r>
-            <w:proofErr w:type="spellStart"/>
-            <w:r>
-              <w:rPr>
-                <w:b/>
-                <w:sz w:val="28"/>
-                <w:szCs w:val="28"/>
-              </w:rPr>
-              <w:t>matter.other_key_team_members</w:t>
-            </w:r>
-            <w:proofErr w:type="spellEnd"/>
-            <w:r>
-              <w:rPr>
-                <w:b/>
-                <w:sz w:val="28"/>
-                <w:szCs w:val="28"/>
-              </w:rPr>
-              <w:t>[0].office</w:t>
-            </w:r>
-            <w:r>
-              <w:rPr>
-                <w:b/>
-                <w:sz w:val="28"/>
-                <w:szCs w:val="28"/>
-              </w:rPr>
-              <w:t xml:space="preserve"> }}</w:t>
+            <w:r>
+              <w:t>{{ matter.other_partners[0].office }}</w:t>
             </w:r>
           </w:p>
         </w:tc>
@@ -12837,56 +11525,8 @@
             <w:shd w:val="clear" w:color="auto" w:fill="FDDFDF"/>
           </w:tcPr>
           <w:p>
-            <w:pPr>
-              <w:rPr>
-                <w:b/>
-                <w:sz w:val="28"/>
-                <w:szCs w:val="28"/>
-              </w:rPr>
-            </w:pPr>
-            <w:r>
-              <w:rPr>
-                <w:b/>
-                <w:sz w:val="28"/>
-                <w:szCs w:val="28"/>
-              </w:rPr>
-              <w:t xml:space="preserve">{{ </w:t>
-            </w:r>
-            <w:proofErr w:type="spellStart"/>
-            <w:r>
-              <w:rPr>
-                <w:b/>
-                <w:sz w:val="28"/>
-                <w:szCs w:val="28"/>
-              </w:rPr>
-              <w:t>matter.other_key_team_members</w:t>
-            </w:r>
-            <w:proofErr w:type="spellEnd"/>
-            <w:r>
-              <w:rPr>
-                <w:b/>
-                <w:sz w:val="28"/>
-                <w:szCs w:val="28"/>
-              </w:rPr>
-              <w:t>[0].</w:t>
-            </w:r>
-            <w:proofErr w:type="spellStart"/>
-            <w:r>
-              <w:rPr>
-                <w:b/>
-                <w:sz w:val="28"/>
-                <w:szCs w:val="28"/>
-              </w:rPr>
-              <w:t>practice_area</w:t>
-            </w:r>
-            <w:proofErr w:type="spellEnd"/>
-            <w:r>
-              <w:rPr>
-                <w:b/>
-                <w:sz w:val="28"/>
-                <w:szCs w:val="28"/>
-              </w:rPr>
-              <w:t xml:space="preserve"> }}</w:t>
+            <w:r>
+              <w:t>{{ matter.other_partners[0].practice_area }}</w:t>
             </w:r>
           </w:p>
         </w:tc>
@@ -12902,55 +11542,8 @@
             <w:shd w:val="clear" w:color="auto" w:fill="FDDFDF"/>
           </w:tcPr>
           <w:p>
-            <w:pPr>
-              <w:rPr>
-                <w:b/>
-                <w:sz w:val="28"/>
-                <w:szCs w:val="28"/>
-              </w:rPr>
-            </w:pPr>
-            <w:r>
-              <w:rPr>
-                <w:b/>
-                <w:sz w:val="28"/>
-                <w:szCs w:val="28"/>
-              </w:rPr>
-              <w:lastRenderedPageBreak/>
-              <w:t xml:space="preserve">{{ </w:t>
-            </w:r>
-            <w:proofErr w:type="spellStart"/>
-            <w:r>
-              <w:rPr>
-                <w:b/>
-                <w:sz w:val="28"/>
-                <w:szCs w:val="28"/>
-              </w:rPr>
-              <w:t>matter.other_key_team_members</w:t>
-            </w:r>
-            <w:proofErr w:type="spellEnd"/>
-            <w:r>
-              <w:rPr>
-                <w:b/>
-                <w:sz w:val="28"/>
-                <w:szCs w:val="28"/>
-              </w:rPr>
-              <w:t>[1</w:t>
-            </w:r>
-            <w:r>
-              <w:rPr>
-                <w:b/>
-                <w:sz w:val="28"/>
-                <w:szCs w:val="28"/>
-              </w:rPr>
-              <w:t>].name</w:t>
-            </w:r>
-            <w:r>
-              <w:rPr>
-                <w:b/>
-                <w:sz w:val="28"/>
-                <w:szCs w:val="28"/>
-              </w:rPr>
-              <w:t xml:space="preserve"> }}</w:t>
+            <w:r>
+              <w:t>{{ matter.other_partners[1].name }}</w:t>
             </w:r>
           </w:p>
         </w:tc>
@@ -12964,54 +11557,8 @@
             <w:shd w:val="clear" w:color="auto" w:fill="FDDFDF"/>
           </w:tcPr>
           <w:p>
-            <w:pPr>
-              <w:rPr>
-                <w:b/>
-                <w:sz w:val="28"/>
-                <w:szCs w:val="28"/>
-              </w:rPr>
-            </w:pPr>
-            <w:r>
-              <w:rPr>
-                <w:b/>
-                <w:sz w:val="28"/>
-                <w:szCs w:val="28"/>
-              </w:rPr>
-              <w:t xml:space="preserve">{{ </w:t>
-            </w:r>
-            <w:proofErr w:type="spellStart"/>
-            <w:r>
-              <w:rPr>
-                <w:b/>
-                <w:sz w:val="28"/>
-                <w:szCs w:val="28"/>
-              </w:rPr>
-              <w:t>matter.other_key_team_members</w:t>
-            </w:r>
-            <w:proofErr w:type="spellEnd"/>
-            <w:r>
-              <w:rPr>
-                <w:b/>
-                <w:sz w:val="28"/>
-                <w:szCs w:val="28"/>
-              </w:rPr>
-              <w:t>[1</w:t>
-            </w:r>
-            <w:r>
-              <w:rPr>
-                <w:b/>
-                <w:sz w:val="28"/>
-                <w:szCs w:val="28"/>
-              </w:rPr>
-              <w:t>].office</w:t>
-            </w:r>
-            <w:r>
-              <w:rPr>
-                <w:b/>
-                <w:sz w:val="28"/>
-                <w:szCs w:val="28"/>
-              </w:rPr>
-              <w:t xml:space="preserve"> }}</w:t>
+            <w:r>
+              <w:t>{{ matter.other_partners[1].office }}</w:t>
             </w:r>
           </w:p>
         </w:tc>
@@ -13024,64 +11571,8 @@
             <w:shd w:val="clear" w:color="auto" w:fill="FDDFDF"/>
           </w:tcPr>
           <w:p>
-            <w:pPr>
-              <w:rPr>
-                <w:b/>
-                <w:sz w:val="28"/>
-                <w:szCs w:val="28"/>
-              </w:rPr>
-            </w:pPr>
-            <w:r>
-              <w:rPr>
-                <w:b/>
-                <w:sz w:val="28"/>
-                <w:szCs w:val="28"/>
-              </w:rPr>
-              <w:t xml:space="preserve">{{ </w:t>
-            </w:r>
-            <w:proofErr w:type="spellStart"/>
-            <w:r>
-              <w:rPr>
-                <w:b/>
-                <w:sz w:val="28"/>
-                <w:szCs w:val="28"/>
-              </w:rPr>
-              <w:t>matter.other_key_team_members</w:t>
-            </w:r>
-            <w:proofErr w:type="spellEnd"/>
-            <w:r>
-              <w:rPr>
-                <w:b/>
-                <w:sz w:val="28"/>
-                <w:szCs w:val="28"/>
-              </w:rPr>
-              <w:t>[1</w:t>
-            </w:r>
-            <w:r>
-              <w:rPr>
-                <w:b/>
-                <w:sz w:val="28"/>
-                <w:szCs w:val="28"/>
-              </w:rPr>
-              <w:t>].</w:t>
-            </w:r>
-            <w:proofErr w:type="spellStart"/>
-            <w:r>
-              <w:rPr>
-                <w:b/>
-                <w:sz w:val="28"/>
-                <w:szCs w:val="28"/>
-              </w:rPr>
-              <w:t>practice_area</w:t>
-            </w:r>
-            <w:proofErr w:type="spellEnd"/>
-            <w:r>
-              <w:rPr>
-                <w:b/>
-                <w:sz w:val="28"/>
-                <w:szCs w:val="28"/>
-              </w:rPr>
-              <w:t xml:space="preserve"> }}</w:t>
+            <w:r>
+              <w:t>{{ matter.other_partners[1].practice_area }}</w:t>
             </w:r>
           </w:p>
         </w:tc>
@@ -13559,15 +12050,7 @@
     </w:p>
     <w:p>
       <w:r>
-        <w:t xml:space="preserve">{% p </w:t>
-      </w:r>
-      <w:proofErr w:type="spellStart"/>
-      <w:r>
-        <w:t>endfor</w:t>
-      </w:r>
-      <w:proofErr w:type="spellEnd"/>
-      <w:r>
-        <w:t xml:space="preserve"> %}</w:t>
+        <w:t>{% endfor %}</w:t>
       </w:r>
     </w:p>
     <w:sectPr>

</xml_diff>

<commit_message>
fix: Correct formatting and structure in legal500 submissions template
</commit_message>
<xml_diff>
--- a/templates/legal500-us-submissions-template-2026-1-1-2.docx
+++ b/templates/legal500-us-submissions-template-2026-1-1-2.docx
@@ -3259,7 +3259,7 @@
               </wp:anchor>
             </w:drawing>
           </mc:Choice>
-          <mc:Fallback xmlns:cx1="http://schemas.microsoft.com/office/drawing/2015/9/8/chartex" xmlns:cx2="http://schemas.microsoft.com/office/drawing/2015/10/21/chartex" xmlns:cx3="http://schemas.microsoft.com/office/drawing/2016/5/9/chartex" xmlns:cx4="http://schemas.microsoft.com/office/drawing/2016/5/10/chartex" xmlns:cx5="http://schemas.microsoft.com/office/drawing/2016/5/11/chartex" xmlns:cx6="http://schemas.microsoft.com/office/drawing/2016/5/12/chartex" xmlns:cx7="http://schemas.microsoft.com/office/drawing/2016/5/13/chartex" xmlns:cx8="http://schemas.microsoft.com/office/drawing/2016/5/14/chartex" xmlns:aink="http://schemas.microsoft.com/office/drawing/2016/ink" xmlns:am3d="http://schemas.microsoft.com/office/drawing/2017/model3d" xmlns:oel="http://schemas.microsoft.com/office/2019/extlst" xmlns:w16cex="http://schemas.microsoft.com/office/word/2018/wordml/cex" xmlns:w16cid="http://schemas.microsoft.com/office/word/2016/wordml/cid" xmlns:w16="http://schemas.microsoft.com/office/word/2018/wordml" xmlns:w16du="http://schemas.microsoft.com/office/word/2023/wordml/word16du" xmlns:w16sdtdh="http://schemas.microsoft.com/office/word/2020/wordml/sdtdatahash" xmlns:w16sdtfl="http://schemas.microsoft.com/office/word/2024/wordml/sdtformatlock">
+          <mc:Fallback xmlns:w16sdtfl="http://schemas.microsoft.com/office/word/2024/wordml/sdtformatlock" xmlns:w16sdtdh="http://schemas.microsoft.com/office/word/2020/wordml/sdtdatahash" xmlns:w16du="http://schemas.microsoft.com/office/word/2023/wordml/word16du" xmlns:w16="http://schemas.microsoft.com/office/word/2018/wordml" xmlns:w16cid="http://schemas.microsoft.com/office/word/2016/wordml/cid" xmlns:w16cex="http://schemas.microsoft.com/office/word/2018/wordml/cex" xmlns:oel="http://schemas.microsoft.com/office/2019/extlst" xmlns:am3d="http://schemas.microsoft.com/office/drawing/2017/model3d" xmlns:aink="http://schemas.microsoft.com/office/drawing/2016/ink" xmlns:cx8="http://schemas.microsoft.com/office/drawing/2016/5/14/chartex" xmlns:cx7="http://schemas.microsoft.com/office/drawing/2016/5/13/chartex" xmlns:cx6="http://schemas.microsoft.com/office/drawing/2016/5/12/chartex" xmlns:cx5="http://schemas.microsoft.com/office/drawing/2016/5/11/chartex" xmlns:cx4="http://schemas.microsoft.com/office/drawing/2016/5/10/chartex" xmlns:cx3="http://schemas.microsoft.com/office/drawing/2016/5/9/chartex" xmlns:cx2="http://schemas.microsoft.com/office/drawing/2015/10/21/chartex" xmlns:cx1="http://schemas.microsoft.com/office/drawing/2015/9/8/chartex">
             <w:pict>
               <v:shape w14:anchorId="6FE7FF6C" id="Diagonal Stripe 10" o:spid="_x0000_s1026" style="position:absolute;margin-left:340.05pt;margin-top:-70.55pt;width:391.25pt;height:321.8pt;flip:x;z-index:251660288;visibility:visible;mso-wrap-style:square;mso-width-percent:0;mso-height-percent:0;mso-wrap-distance-left:9pt;mso-wrap-distance-top:0;mso-wrap-distance-right:9pt;mso-wrap-distance-bottom:0;mso-position-horizontal:right;mso-position-horizontal-relative:page;mso-position-vertical:absolute;mso-position-vertical-relative:text;mso-width-percent:0;mso-height-percent:0;mso-width-relative:margin;mso-height-relative:margin;v-text-anchor:middle" coordsize="4968737,4086971" o:gfxdata="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" path="m,2043486l2484369,,4968737,,,4086971,,2043486xe" fillcolor="red" strokecolor="black [3213]" strokeweight="3.75pt">
                 <v:stroke joinstyle="miter"/>
@@ -3772,8 +3772,9 @@
           <w:p>
             <w:r>
               <w:t>Active key clients (over the last 12 months)</w:t>
+            </w:r>
+            <w:r>
               <w:br/>
-              <w:t>{% for client in publishable_clients %}</w:t>
             </w:r>
           </w:p>
         </w:tc>
@@ -3820,6 +3821,20 @@
               </w:rPr>
             </w:pPr>
             <w:r>
+              <w:t xml:space="preserve">{% for client in </w:t>
+            </w:r>
+            <w:proofErr w:type="spellStart"/>
+            <w:r>
+              <w:t>publishable_clients</w:t>
+            </w:r>
+            <w:proofErr w:type="spellEnd"/>
+            <w:r>
+              <w:t xml:space="preserve"> %}</w:t>
+            </w:r>
+            <w:r>
+              <w:t xml:space="preserve"> </w:t>
+            </w:r>
+            <w:r>
               <w:rPr>
                 <w:b/>
                 <w:sz w:val="28"/>
@@ -3854,7 +3869,15 @@
           </w:tcPr>
           <w:p>
             <w:r>
-              <w:t>{{ client.is_new_client }}}</w:t>
+              <w:t xml:space="preserve">{{ </w:t>
+            </w:r>
+            <w:proofErr w:type="spellStart"/>
+            <w:r>
+              <w:t>client.is_new_client</w:t>
+            </w:r>
+            <w:proofErr w:type="spellEnd"/>
+            <w:r>
+              <w:t xml:space="preserve"> }}</w:t>
             </w:r>
           </w:p>
         </w:tc>
@@ -4242,9 +4265,12 @@
           <w:p>
             <w:r>
               <w:t>Active key clients (over the last 12 months)</w:t>
+            </w:r>
+            <w:r>
               <w:br/>
+            </w:r>
+            <w:r>
               <w:br/>
-              <w:t>{% for client in non_publishable_clients %}</w:t>
             </w:r>
           </w:p>
         </w:tc>
@@ -4290,6 +4316,17 @@
               </w:rPr>
             </w:pPr>
             <w:r>
+              <w:t xml:space="preserve">{% for client in </w:t>
+            </w:r>
+            <w:proofErr w:type="spellStart"/>
+            <w:r>
+              <w:t>non_publishable_clients</w:t>
+            </w:r>
+            <w:proofErr w:type="spellEnd"/>
+            <w:r>
+              <w:t xml:space="preserve"> %}</w:t>
+            </w:r>
+            <w:r>
               <w:rPr>
                 <w:b/>
                 <w:sz w:val="28"/>
@@ -4407,6 +4444,8 @@
                 <w:szCs w:val="28"/>
               </w:rPr>
             </w:pPr>
+            <w:bookmarkStart w:id="0" w:name="_GoBack"/>
+            <w:bookmarkEnd w:id="0"/>
           </w:p>
         </w:tc>
         <w:tc>
@@ -4636,6 +4675,7 @@
                 <w:b/>
                 <w:color w:val="FFFFFF" w:themeColor="background1"/>
               </w:rPr>
+              <w:lastRenderedPageBreak/>
               <w:br/>
             </w:r>
             <w:r>
@@ -4672,7 +4712,6 @@
           <w:sz w:val="28"/>
           <w:szCs w:val="28"/>
         </w:rPr>
-        <w:lastRenderedPageBreak/>
         <w:t>Your team - Partners: leading partners</w:t>
       </w:r>
     </w:p>
@@ -5179,6 +5218,7 @@
                 <w:sz w:val="20"/>
                 <w:szCs w:val="20"/>
               </w:rPr>
+              <w:lastRenderedPageBreak/>
               <w:t>{{ individual_nomi</w:t>
             </w:r>
             <w:r>
@@ -5243,7 +5283,6 @@
                 <w:sz w:val="28"/>
                 <w:szCs w:val="28"/>
               </w:rPr>
-              <w:lastRenderedPageBreak/>
               <w:t>Partner: l</w:t>
             </w:r>
             <w:r>
@@ -5497,14 +5536,7 @@
                 <w:sz w:val="20"/>
                 <w:szCs w:val="20"/>
               </w:rPr>
-              <w:t>ons.leading_partners[1</w:t>
-            </w:r>
-            <w:r>
-              <w:rPr>
-                <w:sz w:val="20"/>
-                <w:szCs w:val="20"/>
-              </w:rPr>
-              <w:t>].ranked_in_previous_edition</w:t>
+              <w:t>ons.leading_partners[1].ranked_in_previous_edition</w:t>
             </w:r>
             <w:r>
               <w:rPr>
@@ -5563,6 +5595,7 @@
                 <w:sz w:val="20"/>
                 <w:szCs w:val="20"/>
               </w:rPr>
+              <w:lastRenderedPageBreak/>
               <w:t>{{ individual_nomi</w:t>
             </w:r>
             <w:r>
@@ -5570,14 +5603,7 @@
                 <w:sz w:val="20"/>
                 <w:szCs w:val="20"/>
               </w:rPr>
-              <w:t>nations.leading_partners[1</w:t>
-            </w:r>
-            <w:r>
-              <w:rPr>
-                <w:sz w:val="20"/>
-                <w:szCs w:val="20"/>
-              </w:rPr>
-              <w:t>].supporting_information</w:t>
+              <w:t>nations.leading_partners[1].supporting_information</w:t>
             </w:r>
             <w:r>
               <w:rPr>
@@ -5956,21 +5982,7 @@
                 <w:sz w:val="20"/>
                 <w:szCs w:val="20"/>
               </w:rPr>
-              <w:t>nations.leading_partne</w:t>
-            </w:r>
-            <w:r>
-              <w:rPr>
-                <w:sz w:val="20"/>
-                <w:szCs w:val="20"/>
-              </w:rPr>
-              <w:t>rs[2</w:t>
-            </w:r>
-            <w:r>
-              <w:rPr>
-                <w:sz w:val="20"/>
-                <w:szCs w:val="20"/>
-              </w:rPr>
-              <w:t>].</w:t>
+              <w:t>nations.leading_partners[2].</w:t>
             </w:r>
             <w:r>
               <w:rPr>
@@ -6019,7 +6031,6 @@
           <w:sz w:val="28"/>
           <w:szCs w:val="28"/>
         </w:rPr>
-        <w:lastRenderedPageBreak/>
         <w:t xml:space="preserve">Your team - Partners: next generation partners </w:t>
       </w:r>
     </w:p>
@@ -6056,6 +6067,7 @@
                 <w:sz w:val="20"/>
                 <w:szCs w:val="20"/>
               </w:rPr>
+              <w:lastRenderedPageBreak/>
               <w:t xml:space="preserve">Please provide information about junior/new/younger </w:t>
             </w:r>
             <w:r>
@@ -6322,14 +6334,7 @@
                 <w:sz w:val="20"/>
                 <w:szCs w:val="20"/>
               </w:rPr>
-              <w:t>[0</w:t>
-            </w:r>
-            <w:r>
-              <w:rPr>
-                <w:sz w:val="20"/>
-                <w:szCs w:val="20"/>
-              </w:rPr>
-              <w:t>].location</w:t>
+              <w:t>[0].location</w:t>
             </w:r>
             <w:r>
               <w:rPr>
@@ -6395,14 +6400,7 @@
                 <w:sz w:val="20"/>
                 <w:szCs w:val="20"/>
               </w:rPr>
-              <w:t>l_nominations.next_generation_partners[0</w:t>
-            </w:r>
-            <w:r>
-              <w:rPr>
-                <w:sz w:val="20"/>
-                <w:szCs w:val="20"/>
-              </w:rPr>
-              <w:t>].supporting_information</w:t>
+              <w:t>l_nominations.next_generation_partners[0].supporting_information</w:t>
             </w:r>
             <w:r>
               <w:rPr>
@@ -6564,14 +6562,7 @@
                 <w:sz w:val="20"/>
                 <w:szCs w:val="20"/>
               </w:rPr>
-              <w:t>[</w:t>
-            </w:r>
-            <w:r>
-              <w:rPr>
-                <w:sz w:val="20"/>
-                <w:szCs w:val="20"/>
-              </w:rPr>
-              <w:t>1</w:t>
+              <w:t>[1</w:t>
             </w:r>
             <w:r>
               <w:rPr>
@@ -6621,21 +6612,7 @@
                 <w:sz w:val="20"/>
                 <w:szCs w:val="20"/>
               </w:rPr>
-              <w:t>[</w:t>
-            </w:r>
-            <w:r>
-              <w:rPr>
-                <w:sz w:val="20"/>
-                <w:szCs w:val="20"/>
-              </w:rPr>
-              <w:t>1</w:t>
-            </w:r>
-            <w:r>
-              <w:rPr>
-                <w:sz w:val="20"/>
-                <w:szCs w:val="20"/>
-              </w:rPr>
-              <w:t>].location</w:t>
+              <w:t>[1].location</w:t>
             </w:r>
             <w:r>
               <w:rPr>
@@ -6701,21 +6678,7 @@
                 <w:sz w:val="20"/>
                 <w:szCs w:val="20"/>
               </w:rPr>
-              <w:t>l_nominations.next_generation_partners[</w:t>
-            </w:r>
-            <w:r>
-              <w:rPr>
-                <w:sz w:val="20"/>
-                <w:szCs w:val="20"/>
-              </w:rPr>
-              <w:t>1</w:t>
-            </w:r>
-            <w:r>
-              <w:rPr>
-                <w:sz w:val="20"/>
-                <w:szCs w:val="20"/>
-              </w:rPr>
-              <w:t>].supporting_information</w:t>
+              <w:t>l_nominations.next_generation_partners[1].supporting_information</w:t>
             </w:r>
             <w:r>
               <w:rPr>
@@ -6766,7 +6729,6 @@
           <w:sz w:val="28"/>
           <w:szCs w:val="28"/>
         </w:rPr>
-        <w:lastRenderedPageBreak/>
         <w:t>Your team - Associates: leading associates</w:t>
       </w:r>
     </w:p>
@@ -6803,6 +6765,7 @@
                 <w:sz w:val="20"/>
                 <w:szCs w:val="20"/>
               </w:rPr>
+              <w:lastRenderedPageBreak/>
               <w:t xml:space="preserve">Please provide information about junior/new/younger </w:t>
             </w:r>
             <w:r>
@@ -7027,14 +6990,7 @@
                 <w:sz w:val="20"/>
                 <w:szCs w:val="20"/>
               </w:rPr>
-              <w:t>l_nomin</w:t>
-            </w:r>
-            <w:r>
-              <w:rPr>
-                <w:sz w:val="20"/>
-                <w:szCs w:val="20"/>
-              </w:rPr>
-              <w:t>ations.leading_associates</w:t>
+              <w:t>l_nominations.leading_associates</w:t>
             </w:r>
             <w:proofErr w:type="spellEnd"/>
             <w:r>
@@ -7042,14 +6998,7 @@
                 <w:sz w:val="20"/>
                 <w:szCs w:val="20"/>
               </w:rPr>
-              <w:t>[</w:t>
-            </w:r>
-            <w:r>
-              <w:rPr>
-                <w:sz w:val="20"/>
-                <w:szCs w:val="20"/>
-              </w:rPr>
-              <w:t>0</w:t>
+              <w:t>[0</w:t>
             </w:r>
             <w:r>
               <w:rPr>
@@ -7099,14 +7048,7 @@
                 <w:sz w:val="20"/>
                 <w:szCs w:val="20"/>
               </w:rPr>
-              <w:t>[0</w:t>
-            </w:r>
-            <w:r>
-              <w:rPr>
-                <w:sz w:val="20"/>
-                <w:szCs w:val="20"/>
-              </w:rPr>
-              <w:t>].location</w:t>
+              <w:t>[0].location</w:t>
             </w:r>
             <w:r>
               <w:rPr>
@@ -7172,14 +7114,7 @@
                 <w:sz w:val="20"/>
                 <w:szCs w:val="20"/>
               </w:rPr>
-              <w:t>l_nominations.leading_associates[0</w:t>
-            </w:r>
-            <w:r>
-              <w:rPr>
-                <w:sz w:val="20"/>
-                <w:szCs w:val="20"/>
-              </w:rPr>
-              <w:t>].supporting_information</w:t>
+              <w:t>l_nominations.leading_associates[0].supporting_information</w:t>
             </w:r>
             <w:r>
               <w:rPr>
@@ -7341,14 +7276,7 @@
                 <w:sz w:val="20"/>
                 <w:szCs w:val="20"/>
               </w:rPr>
-              <w:t>[</w:t>
-            </w:r>
-            <w:r>
-              <w:rPr>
-                <w:sz w:val="20"/>
-                <w:szCs w:val="20"/>
-              </w:rPr>
-              <w:t>1</w:t>
+              <w:t>[1</w:t>
             </w:r>
             <w:r>
               <w:rPr>
@@ -7398,21 +7326,7 @@
                 <w:sz w:val="20"/>
                 <w:szCs w:val="20"/>
               </w:rPr>
-              <w:t>[</w:t>
-            </w:r>
-            <w:r>
-              <w:rPr>
-                <w:sz w:val="20"/>
-                <w:szCs w:val="20"/>
-              </w:rPr>
-              <w:t>1</w:t>
-            </w:r>
-            <w:r>
-              <w:rPr>
-                <w:sz w:val="20"/>
-                <w:szCs w:val="20"/>
-              </w:rPr>
-              <w:t>].location</w:t>
+              <w:t>[1].location</w:t>
             </w:r>
             <w:r>
               <w:rPr>
@@ -7478,21 +7392,7 @@
                 <w:sz w:val="20"/>
                 <w:szCs w:val="20"/>
               </w:rPr>
-              <w:t>l_nominations.leading_associates[</w:t>
-            </w:r>
-            <w:r>
-              <w:rPr>
-                <w:sz w:val="20"/>
-                <w:szCs w:val="20"/>
-              </w:rPr>
-              <w:t>1</w:t>
-            </w:r>
-            <w:r>
-              <w:rPr>
-                <w:sz w:val="20"/>
-                <w:szCs w:val="20"/>
-              </w:rPr>
-              <w:t>].supporting_information</w:t>
+              <w:t>l_nominations.leading_associates[1].supporting_information</w:t>
             </w:r>
             <w:r>
               <w:rPr>
@@ -7527,7 +7427,6 @@
           <w:sz w:val="28"/>
           <w:szCs w:val="28"/>
         </w:rPr>
-        <w:lastRenderedPageBreak/>
         <w:t>Your team: significant recent arrivals and partner-level departures</w:t>
       </w:r>
     </w:p>
@@ -7566,8 +7465,13 @@
           <w:p>
             <w:r>
               <w:t>Name (English)</w:t>
+            </w:r>
+            <w:r>
               <w:br/>
-              <w:t>{% for team in ArrivalDeparture %}</w:t>
+              <w:t xml:space="preserve">{% for team in </w:t>
+            </w:r>
+            <w:r>
+              <w:t>ArrivalDeparture %}</w:t>
             </w:r>
           </w:p>
         </w:tc>
@@ -9065,14 +8969,7 @@
                 <w:sz w:val="28"/>
                 <w:szCs w:val="28"/>
               </w:rPr>
-              <w:t>Wo</w:t>
-            </w:r>
-            <w:r>
-              <w:rPr>
-                <w:sz w:val="28"/>
-                <w:szCs w:val="28"/>
-              </w:rPr>
-              <w:t>rkHighlight</w:t>
+              <w:t>WorkHighlight</w:t>
             </w:r>
             <w:proofErr w:type="spellEnd"/>
             <w:r>
@@ -9088,14 +8985,7 @@
                 <w:sz w:val="28"/>
                 <w:szCs w:val="28"/>
               </w:rPr>
-              <w:t>publishable_</w:t>
-            </w:r>
-            <w:r>
-              <w:rPr>
-                <w:sz w:val="28"/>
-                <w:szCs w:val="28"/>
-              </w:rPr>
-              <w:t>summary</w:t>
+              <w:t>publishable_summary</w:t>
             </w:r>
             <w:proofErr w:type="spellEnd"/>
             <w:r>
@@ -9195,14 +9085,7 @@
                 <w:sz w:val="28"/>
                 <w:szCs w:val="28"/>
               </w:rPr>
-              <w:t>Wo</w:t>
-            </w:r>
-            <w:r>
-              <w:rPr>
-                <w:sz w:val="28"/>
-                <w:szCs w:val="28"/>
-              </w:rPr>
-              <w:t>rkHighlight</w:t>
+              <w:t>WorkHighlight</w:t>
             </w:r>
             <w:proofErr w:type="spellEnd"/>
             <w:r>
@@ -9218,14 +9101,7 @@
                 <w:sz w:val="28"/>
                 <w:szCs w:val="28"/>
               </w:rPr>
-              <w:t>publishable</w:t>
-            </w:r>
-            <w:r>
-              <w:rPr>
-                <w:sz w:val="28"/>
-                <w:szCs w:val="28"/>
-              </w:rPr>
-              <w:t>_summary</w:t>
+              <w:t>publishable_summary</w:t>
             </w:r>
             <w:proofErr w:type="spellEnd"/>
             <w:r>
@@ -9380,11 +9256,11 @@
         <w:tblLook w:val="04A0" w:firstRow="1" w:lastRow="0" w:firstColumn="1" w:lastColumn="0" w:noHBand="0" w:noVBand="1"/>
       </w:tblPr>
       <w:tblGrid>
-        <w:gridCol w:w="2588"/>
-        <w:gridCol w:w="330"/>
-        <w:gridCol w:w="1843"/>
-        <w:gridCol w:w="1120"/>
-        <w:gridCol w:w="3135"/>
+        <w:gridCol w:w="2605"/>
+        <w:gridCol w:w="350"/>
+        <w:gridCol w:w="1868"/>
+        <w:gridCol w:w="1133"/>
+        <w:gridCol w:w="3060"/>
       </w:tblGrid>
       <w:tr>
         <w:trPr>
@@ -9963,7 +9839,10 @@
           </w:tcPr>
           <w:p>
             <w:r>
-              <w:t>{{ matter.leading_partners[0].name }}</w:t>
+              <w:t xml:space="preserve">{{ </w:t>
+            </w:r>
+            <w:r>
+              <w:t>matter.leading_partners[0].name }}</w:t>
             </w:r>
           </w:p>
         </w:tc>
@@ -10220,7 +10099,10 @@
           </w:tcPr>
           <w:p>
             <w:r>
-              <w:t>{{ matter.other_partners[1].practice_area }}</w:t>
+              <w:t xml:space="preserve">{{ </w:t>
+            </w:r>
+            <w:r>
+              <w:t>matter.other_partners[1].practice_area }}</w:t>
             </w:r>
           </w:p>
         </w:tc>
@@ -10252,7 +10134,6 @@
                 <w:sz w:val="28"/>
                 <w:szCs w:val="28"/>
               </w:rPr>
-              <w:lastRenderedPageBreak/>
               <w:t>Other firms advising on the matter and their role(s)</w:t>
             </w:r>
           </w:p>
@@ -10373,6 +10254,7 @@
                 <w:sz w:val="28"/>
                 <w:szCs w:val="28"/>
               </w:rPr>
+              <w:lastRenderedPageBreak/>
               <w:t xml:space="preserve">{{ </w:t>
             </w:r>
             <w:proofErr w:type="spellStart"/>
@@ -10739,11 +10621,11 @@
         <w:tblLook w:val="04A0" w:firstRow="1" w:lastRow="0" w:firstColumn="1" w:lastColumn="0" w:noHBand="0" w:noVBand="1"/>
       </w:tblPr>
       <w:tblGrid>
-        <w:gridCol w:w="2624"/>
-        <w:gridCol w:w="296"/>
-        <w:gridCol w:w="1604"/>
-        <w:gridCol w:w="1360"/>
-        <w:gridCol w:w="3137"/>
+        <w:gridCol w:w="2642"/>
+        <w:gridCol w:w="314"/>
+        <w:gridCol w:w="1626"/>
+        <w:gridCol w:w="1377"/>
+        <w:gridCol w:w="3062"/>
       </w:tblGrid>
       <w:tr>
         <w:trPr>
@@ -11370,7 +11252,10 @@
           </w:tcPr>
           <w:p>
             <w:r>
-              <w:t>{{ matter.leading_partners[1].office }}</w:t>
+              <w:t xml:space="preserve">{{ </w:t>
+            </w:r>
+            <w:r>
+              <w:t>matter.leading_partners[1].office }}</w:t>
             </w:r>
           </w:p>
         </w:tc>
@@ -11633,6 +11518,7 @@
               <w:rPr>
                 <w:b/>
               </w:rPr>
+              <w:lastRenderedPageBreak/>
               <w:t>Firm name</w:t>
             </w:r>
           </w:p>
@@ -12045,8 +11931,6 @@
           <w:u w:val="single"/>
         </w:rPr>
       </w:pPr>
-      <w:bookmarkStart w:id="0" w:name="_GoBack"/>
-      <w:bookmarkEnd w:id="0"/>
     </w:p>
     <w:p>
       <w:r>
@@ -13504,6 +13388,7 @@
     <w:rsid w:val="00D22616"/>
     <w:rsid w:val="00E456C7"/>
     <w:rsid w:val="00E909D1"/>
+    <w:rsid w:val="00F40B5F"/>
   </w:rsids>
   <m:mathPr>
     <m:mathFont m:val="Cambria Math"/>
@@ -14237,7 +14122,7 @@
 </file>
 
 <file path=customXml/itemProps1.xml><?xml version="1.0" encoding="utf-8"?>
-<ds:datastoreItem xmlns:ds="http://schemas.openxmlformats.org/officeDocument/2006/customXml" ds:itemID="{559AA101-4F54-4725-AB63-4A32CB4F0ED4}">
+<ds:datastoreItem xmlns:ds="http://schemas.openxmlformats.org/officeDocument/2006/customXml" ds:itemID="{49BFBCF5-3A60-48EE-A2C0-140959C30235}">
   <ds:schemaRefs>
     <ds:schemaRef ds:uri="http://schemas.openxmlformats.org/officeDocument/2006/bibliography"/>
   </ds:schemaRefs>

</xml_diff>

<commit_message>
feat: Refactor submission models and optimize handling of publishable and confidential matters
</commit_message>
<xml_diff>
--- a/templates/legal500-us-submissions-template-2026-1-1-2.docx
+++ b/templates/legal500-us-submissions-template-2026-1-1-2.docx
@@ -2151,7 +2151,7 @@
               </wp:anchor>
             </w:drawing>
           </mc:Choice>
-          <mc:Fallback xmlns:cx1="http://schemas.microsoft.com/office/drawing/2015/9/8/chartex" xmlns:cx2="http://schemas.microsoft.com/office/drawing/2015/10/21/chartex" xmlns:cx3="http://schemas.microsoft.com/office/drawing/2016/5/9/chartex" xmlns:cx4="http://schemas.microsoft.com/office/drawing/2016/5/10/chartex" xmlns:cx5="http://schemas.microsoft.com/office/drawing/2016/5/11/chartex" xmlns:cx6="http://schemas.microsoft.com/office/drawing/2016/5/12/chartex" xmlns:cx7="http://schemas.microsoft.com/office/drawing/2016/5/13/chartex" xmlns:cx8="http://schemas.microsoft.com/office/drawing/2016/5/14/chartex" xmlns:aink="http://schemas.microsoft.com/office/drawing/2016/ink" xmlns:am3d="http://schemas.microsoft.com/office/drawing/2017/model3d" xmlns:oel="http://schemas.microsoft.com/office/2019/extlst" xmlns:w16cex="http://schemas.microsoft.com/office/word/2018/wordml/cex" xmlns:w16cid="http://schemas.microsoft.com/office/word/2016/wordml/cid" xmlns:w16="http://schemas.microsoft.com/office/word/2018/wordml" xmlns:w16du="http://schemas.microsoft.com/office/word/2023/wordml/word16du" xmlns:w16sdtdh="http://schemas.microsoft.com/office/word/2020/wordml/sdtdatahash" xmlns:w16sdtfl="http://schemas.microsoft.com/office/word/2024/wordml/sdtformatlock">
+          <mc:Fallback xmlns:w16sdtfl="http://schemas.microsoft.com/office/word/2024/wordml/sdtformatlock" xmlns:w16sdtdh="http://schemas.microsoft.com/office/word/2020/wordml/sdtdatahash" xmlns:w16du="http://schemas.microsoft.com/office/word/2023/wordml/word16du" xmlns:w16="http://schemas.microsoft.com/office/word/2018/wordml" xmlns:w16cid="http://schemas.microsoft.com/office/word/2016/wordml/cid" xmlns:w16cex="http://schemas.microsoft.com/office/word/2018/wordml/cex" xmlns:oel="http://schemas.microsoft.com/office/2019/extlst" xmlns:am3d="http://schemas.microsoft.com/office/drawing/2017/model3d" xmlns:aink="http://schemas.microsoft.com/office/drawing/2016/ink" xmlns:cx8="http://schemas.microsoft.com/office/drawing/2016/5/14/chartex" xmlns:cx7="http://schemas.microsoft.com/office/drawing/2016/5/13/chartex" xmlns:cx6="http://schemas.microsoft.com/office/drawing/2016/5/12/chartex" xmlns:cx5="http://schemas.microsoft.com/office/drawing/2016/5/11/chartex" xmlns:cx4="http://schemas.microsoft.com/office/drawing/2016/5/10/chartex" xmlns:cx3="http://schemas.microsoft.com/office/drawing/2016/5/9/chartex" xmlns:cx2="http://schemas.microsoft.com/office/drawing/2015/10/21/chartex" xmlns:cx1="http://schemas.microsoft.com/office/drawing/2015/9/8/chartex">
             <w:pict>
               <v:shape w14:anchorId="6FE7FF6C" id="Diagonal Stripe 10" o:spid="_x0000_s1026" style="position:absolute;margin-left:340.05pt;margin-top:-70.55pt;width:391.25pt;height:321.8pt;flip:x;z-index:251660288;visibility:visible;mso-wrap-style:square;mso-width-percent:0;mso-height-percent:0;mso-wrap-distance-left:9pt;mso-wrap-distance-top:0;mso-wrap-distance-right:9pt;mso-wrap-distance-bottom:0;mso-position-horizontal:right;mso-position-horizontal-relative:page;mso-position-vertical:absolute;mso-position-vertical-relative:text;mso-width-percent:0;mso-height-percent:0;mso-width-relative:margin;mso-height-relative:margin;v-text-anchor:middle" coordsize="4968737,4086971" o:gfxdata="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" path="m,2043486l2484369,,4968737,,,4086971,,2043486xe" fillcolor="red" strokecolor="black [3213]" strokeweight="3.75pt">
                 <v:stroke joinstyle="miter"/>
@@ -7121,20 +7121,35 @@
         <w:t>To add additional matters, simply click a matter box, click the small icon in the top left corner, then copy and paste onto a new page.</w:t>
       </w:r>
     </w:p>
-    <w:p/>
-    <w:p/>
-    <w:p/>
-    <w:p/>
-    <w:p/>
+    <w:p>
+      <w:pPr>
+        <w:pStyle w:val="Sinespaciado"/>
+        <w:keepNext/>
+      </w:pPr>
+    </w:p>
+    <w:p>
+      <w:pPr>
+        <w:pStyle w:val="Sinespaciado"/>
+        <w:keepNext/>
+      </w:pPr>
+    </w:p>
     <w:p>
       <w:r>
-        <w:t>{% for matter in publishable_matters %}</w:t>
+        <w:t>{% for matter in publishable_matters</w:t>
       </w:r>
+      <w:r>
+        <w:t xml:space="preserve"> %}</w:t>
+      </w:r>
+    </w:p>
+    <w:p>
+      <w:bookmarkStart w:id="0" w:name="_GoBack"/>
+      <w:bookmarkEnd w:id="0"/>
     </w:p>
     <w:tbl>
       <w:tblPr>
         <w:tblStyle w:val="Tablaconcuadrcula"/>
-        <w:tblpPr w:leftFromText="181" w:rightFromText="181" w:vertAnchor="page" w:horzAnchor="page" w:tblpXSpec="center" w:tblpYSpec="center"/>
+        <w:tblpPr w:leftFromText="181" w:rightFromText="181" w:horzAnchor="margin" w:tblpY="-237"/>
+        <w:tblOverlap w:val="never"/>
         <w:tblW w:w="0" w:type="auto"/>
         <w:tblBorders>
           <w:bottom w:val="none" w:sz="0" w:space="0" w:color="auto"/>
@@ -7142,11 +7157,11 @@
         <w:tblLook w:val="04A0" w:firstRow="1" w:lastRow="0" w:firstColumn="1" w:lastColumn="0" w:noHBand="0" w:noVBand="1"/>
       </w:tblPr>
       <w:tblGrid>
-        <w:gridCol w:w="2605"/>
-        <w:gridCol w:w="350"/>
-        <w:gridCol w:w="1868"/>
-        <w:gridCol w:w="1133"/>
-        <w:gridCol w:w="3060"/>
+        <w:gridCol w:w="2452"/>
+        <w:gridCol w:w="443"/>
+        <w:gridCol w:w="1621"/>
+        <w:gridCol w:w="1487"/>
+        <w:gridCol w:w="3013"/>
       </w:tblGrid>
       <w:tr>
         <w:trPr>
@@ -7184,7 +7199,7 @@
         </w:trPr>
         <w:tc>
           <w:tcPr>
-            <w:tcW w:w="2918" w:type="dxa"/>
+            <w:tcW w:w="2955" w:type="dxa"/>
             <w:gridSpan w:val="2"/>
             <w:shd w:val="clear" w:color="auto" w:fill="D0CECE" w:themeFill="background2" w:themeFillShade="E6"/>
           </w:tcPr>
@@ -7208,7 +7223,7 @@
         </w:tc>
         <w:tc>
           <w:tcPr>
-            <w:tcW w:w="6098" w:type="dxa"/>
+            <w:tcW w:w="6061" w:type="dxa"/>
             <w:gridSpan w:val="3"/>
             <w:shd w:val="clear" w:color="auto" w:fill="D0CECE" w:themeFill="background2" w:themeFillShade="E6"/>
           </w:tcPr>
@@ -7233,7 +7248,7 @@
         </w:trPr>
         <w:tc>
           <w:tcPr>
-            <w:tcW w:w="2918" w:type="dxa"/>
+            <w:tcW w:w="2955" w:type="dxa"/>
             <w:gridSpan w:val="2"/>
             <w:shd w:val="clear" w:color="auto" w:fill="E2EFD9" w:themeFill="accent6" w:themeFillTint="33"/>
           </w:tcPr>
@@ -7251,13 +7266,29 @@
                 <w:sz w:val="28"/>
                 <w:szCs w:val="28"/>
               </w:rPr>
-              <w:t>{{ matter.client_name }}</w:t>
-            </w:r>
-          </w:p>
-        </w:tc>
-        <w:tc>
-          <w:tcPr>
-            <w:tcW w:w="6098" w:type="dxa"/>
+              <w:t xml:space="preserve">{{ </w:t>
+            </w:r>
+            <w:r>
+              <w:rPr>
+                <w:b/>
+                <w:sz w:val="28"/>
+                <w:szCs w:val="28"/>
+              </w:rPr>
+              <w:t>matter</w:t>
+            </w:r>
+            <w:r>
+              <w:rPr>
+                <w:b/>
+                <w:sz w:val="28"/>
+                <w:szCs w:val="28"/>
+              </w:rPr>
+              <w:t>.client_name }}</w:t>
+            </w:r>
+          </w:p>
+        </w:tc>
+        <w:tc>
+          <w:tcPr>
+            <w:tcW w:w="6061" w:type="dxa"/>
             <w:gridSpan w:val="3"/>
             <w:shd w:val="clear" w:color="auto" w:fill="E2EFD9" w:themeFill="accent6" w:themeFillTint="33"/>
           </w:tcPr>
@@ -7275,7 +7306,23 @@
                 <w:sz w:val="28"/>
                 <w:szCs w:val="28"/>
               </w:rPr>
-              <w:t>{{ matter.industry_sector</w:t>
+              <w:t xml:space="preserve">{{ </w:t>
+            </w:r>
+            <w:r>
+              <w:rPr>
+                <w:b/>
+                <w:sz w:val="28"/>
+                <w:szCs w:val="28"/>
+              </w:rPr>
+              <w:t>matter</w:t>
+            </w:r>
+            <w:r>
+              <w:rPr>
+                <w:b/>
+                <w:sz w:val="28"/>
+                <w:szCs w:val="28"/>
+              </w:rPr>
+              <w:t>.industry_sector</w:t>
             </w:r>
             <w:r>
               <w:rPr>
@@ -7344,7 +7391,21 @@
                 <w:sz w:val="20"/>
                 <w:szCs w:val="20"/>
               </w:rPr>
-              <w:t>{{ matter.matter_description</w:t>
+              <w:t xml:space="preserve">{{ </w:t>
+            </w:r>
+            <w:r>
+              <w:rPr>
+                <w:sz w:val="20"/>
+                <w:szCs w:val="20"/>
+              </w:rPr>
+              <w:t>matter</w:t>
+            </w:r>
+            <w:r>
+              <w:rPr>
+                <w:sz w:val="20"/>
+                <w:szCs w:val="20"/>
+              </w:rPr>
+              <w:t>.matter_description</w:t>
             </w:r>
             <w:r>
               <w:rPr>
@@ -7362,7 +7423,7 @@
         </w:trPr>
         <w:tc>
           <w:tcPr>
-            <w:tcW w:w="2590" w:type="dxa"/>
+            <w:tcW w:w="2579" w:type="dxa"/>
             <w:tcBorders>
               <w:bottom w:val="single" w:sz="4" w:space="0" w:color="auto"/>
             </w:tcBorders>
@@ -7388,7 +7449,7 @@
         </w:tc>
         <w:tc>
           <w:tcPr>
-            <w:tcW w:w="6426" w:type="dxa"/>
+            <w:tcW w:w="6437" w:type="dxa"/>
             <w:gridSpan w:val="4"/>
             <w:tcBorders>
               <w:bottom w:val="single" w:sz="4" w:space="0" w:color="auto"/>
@@ -7412,7 +7473,23 @@
                 <w:sz w:val="28"/>
                 <w:szCs w:val="28"/>
               </w:rPr>
-              <w:t>{{ matter.deal_value</w:t>
+              <w:t xml:space="preserve">{{ </w:t>
+            </w:r>
+            <w:r>
+              <w:rPr>
+                <w:b/>
+                <w:sz w:val="28"/>
+                <w:szCs w:val="28"/>
+              </w:rPr>
+              <w:t>matter</w:t>
+            </w:r>
+            <w:r>
+              <w:rPr>
+                <w:b/>
+                <w:sz w:val="28"/>
+                <w:szCs w:val="28"/>
+              </w:rPr>
+              <w:t>.deal_value</w:t>
             </w:r>
             <w:r>
               <w:rPr>
@@ -7520,7 +7597,23 @@
                 <w:sz w:val="28"/>
                 <w:szCs w:val="28"/>
               </w:rPr>
-              <w:t>{{ matter.jurisdictions_involved</w:t>
+              <w:t xml:space="preserve">{{ </w:t>
+            </w:r>
+            <w:r>
+              <w:rPr>
+                <w:b/>
+                <w:sz w:val="28"/>
+                <w:szCs w:val="28"/>
+              </w:rPr>
+              <w:t>matter</w:t>
+            </w:r>
+            <w:r>
+              <w:rPr>
+                <w:b/>
+                <w:sz w:val="28"/>
+                <w:szCs w:val="28"/>
+              </w:rPr>
+              <w:t>.jurisdictions_involved</w:t>
             </w:r>
             <w:r>
               <w:rPr>
@@ -7592,7 +7685,7 @@
         </w:trPr>
         <w:tc>
           <w:tcPr>
-            <w:tcW w:w="2918" w:type="dxa"/>
+            <w:tcW w:w="2955" w:type="dxa"/>
             <w:gridSpan w:val="2"/>
             <w:tcBorders>
               <w:top w:val="nil"/>
@@ -7615,7 +7708,7 @@
         </w:tc>
         <w:tc>
           <w:tcPr>
-            <w:tcW w:w="2963" w:type="dxa"/>
+            <w:tcW w:w="3001" w:type="dxa"/>
             <w:gridSpan w:val="2"/>
             <w:tcBorders>
               <w:top w:val="nil"/>
@@ -7638,7 +7731,7 @@
         </w:tc>
         <w:tc>
           <w:tcPr>
-            <w:tcW w:w="3135" w:type="dxa"/>
+            <w:tcW w:w="3060" w:type="dxa"/>
             <w:tcBorders>
               <w:top w:val="nil"/>
             </w:tcBorders>
@@ -7662,44 +7755,89 @@
       <w:tr>
         <w:tc>
           <w:tcPr>
-            <w:tcW w:w="2918" w:type="dxa"/>
+            <w:tcW w:w="2955" w:type="dxa"/>
             <w:gridSpan w:val="2"/>
             <w:shd w:val="clear" w:color="auto" w:fill="E2EFD9" w:themeFill="accent6" w:themeFillTint="33"/>
           </w:tcPr>
           <w:p>
-            <w:r>
-              <w:t>{{ matter.leading_partners[0].name }}</w:t>
-            </w:r>
-          </w:p>
-        </w:tc>
-        <w:tc>
-          <w:tcPr>
-            <w:tcW w:w="2963" w:type="dxa"/>
+            <w:pPr>
+              <w:rPr>
+                <w:b/>
+                <w:sz w:val="28"/>
+                <w:szCs w:val="28"/>
+              </w:rPr>
+            </w:pPr>
+            <w:r>
+              <w:t xml:space="preserve">{{ </w:t>
+            </w:r>
+            <w:r>
+              <w:t>matter</w:t>
+            </w:r>
+            <w:r>
+              <w:t>.lead_partners</w:t>
+            </w:r>
+            <w:r>
+              <w:t>[0]</w:t>
+            </w:r>
+            <w:r>
+              <w:t>.name }}</w:t>
+            </w:r>
+          </w:p>
+        </w:tc>
+        <w:tc>
+          <w:tcPr>
+            <w:tcW w:w="3001" w:type="dxa"/>
             <w:gridSpan w:val="2"/>
             <w:shd w:val="clear" w:color="auto" w:fill="E2EFD9" w:themeFill="accent6" w:themeFillTint="33"/>
           </w:tcPr>
           <w:p>
-            <w:r>
-              <w:t>{{ matter.leading_partners[0].office }}</w:t>
-            </w:r>
-          </w:p>
-        </w:tc>
-        <w:tc>
-          <w:tcPr>
-            <w:tcW w:w="3135" w:type="dxa"/>
+            <w:pPr>
+              <w:rPr>
+                <w:b/>
+                <w:sz w:val="28"/>
+                <w:szCs w:val="28"/>
+              </w:rPr>
+            </w:pPr>
+            <w:r>
+              <w:t xml:space="preserve">{{ </w:t>
+            </w:r>
+            <w:r>
+              <w:t>matter</w:t>
+            </w:r>
+            <w:r>
+              <w:t>.lead_partners[0].office }}</w:t>
+            </w:r>
+          </w:p>
+        </w:tc>
+        <w:tc>
+          <w:tcPr>
+            <w:tcW w:w="3060" w:type="dxa"/>
             <w:shd w:val="clear" w:color="auto" w:fill="E2EFD9" w:themeFill="accent6" w:themeFillTint="33"/>
           </w:tcPr>
           <w:p>
-            <w:r>
-              <w:t>{{ matter.leading_partners[0].practice_area }}</w:t>
-            </w:r>
-          </w:p>
-        </w:tc>
-      </w:tr>
-      <w:tr>
-        <w:tc>
-          <w:tcPr>
-            <w:tcW w:w="2918" w:type="dxa"/>
+            <w:pPr>
+              <w:rPr>
+                <w:b/>
+                <w:sz w:val="28"/>
+                <w:szCs w:val="28"/>
+              </w:rPr>
+            </w:pPr>
+            <w:r>
+              <w:t xml:space="preserve">{{ </w:t>
+            </w:r>
+            <w:r>
+              <w:t>matter</w:t>
+            </w:r>
+            <w:r>
+              <w:t>.lead_partners.practice_area }}</w:t>
+            </w:r>
+          </w:p>
+        </w:tc>
+      </w:tr>
+      <w:tr>
+        <w:tc>
+          <w:tcPr>
+            <w:tcW w:w="2955" w:type="dxa"/>
             <w:gridSpan w:val="2"/>
             <w:tcBorders>
               <w:bottom w:val="single" w:sz="4" w:space="0" w:color="auto"/>
@@ -7707,14 +7845,27 @@
             <w:shd w:val="clear" w:color="auto" w:fill="E2EFD9" w:themeFill="accent6" w:themeFillTint="33"/>
           </w:tcPr>
           <w:p>
-            <w:r>
-              <w:t>{{ matter.leading_partners[1].name }}</w:t>
-            </w:r>
-          </w:p>
-        </w:tc>
-        <w:tc>
-          <w:tcPr>
-            <w:tcW w:w="2963" w:type="dxa"/>
+            <w:pPr>
+              <w:rPr>
+                <w:b/>
+                <w:sz w:val="28"/>
+                <w:szCs w:val="28"/>
+              </w:rPr>
+            </w:pPr>
+            <w:r>
+              <w:t xml:space="preserve">{{ </w:t>
+            </w:r>
+            <w:r>
+              <w:t>matter</w:t>
+            </w:r>
+            <w:r>
+              <w:t>.lead_partners[1].name }}</w:t>
+            </w:r>
+          </w:p>
+        </w:tc>
+        <w:tc>
+          <w:tcPr>
+            <w:tcW w:w="3001" w:type="dxa"/>
             <w:gridSpan w:val="2"/>
             <w:tcBorders>
               <w:bottom w:val="single" w:sz="4" w:space="0" w:color="auto"/>
@@ -7722,22 +7873,48 @@
             <w:shd w:val="clear" w:color="auto" w:fill="E2EFD9" w:themeFill="accent6" w:themeFillTint="33"/>
           </w:tcPr>
           <w:p>
-            <w:r>
-              <w:t>{{ matter.leading_partners[1].office }}</w:t>
-            </w:r>
-          </w:p>
-        </w:tc>
-        <w:tc>
-          <w:tcPr>
-            <w:tcW w:w="3135" w:type="dxa"/>
+            <w:pPr>
+              <w:rPr>
+                <w:b/>
+                <w:sz w:val="28"/>
+                <w:szCs w:val="28"/>
+              </w:rPr>
+            </w:pPr>
+            <w:r>
+              <w:t xml:space="preserve">{{ </w:t>
+            </w:r>
+            <w:r>
+              <w:t>matter</w:t>
+            </w:r>
+            <w:r>
+              <w:t>.lead_partners[1].office }}</w:t>
+            </w:r>
+          </w:p>
+        </w:tc>
+        <w:tc>
+          <w:tcPr>
+            <w:tcW w:w="3060" w:type="dxa"/>
             <w:tcBorders>
               <w:bottom w:val="single" w:sz="4" w:space="0" w:color="auto"/>
             </w:tcBorders>
             <w:shd w:val="clear" w:color="auto" w:fill="E2EFD9" w:themeFill="accent6" w:themeFillTint="33"/>
           </w:tcPr>
           <w:p>
-            <w:r>
-              <w:t>{{ matter.leading_partners[1].practice_area }}</w:t>
+            <w:pPr>
+              <w:rPr>
+                <w:b/>
+                <w:sz w:val="28"/>
+                <w:szCs w:val="28"/>
+              </w:rPr>
+            </w:pPr>
+            <w:r>
+              <w:t xml:space="preserve">{{ </w:t>
+            </w:r>
+            <w:r>
+              <w:t>matter</w:t>
+            </w:r>
+            <w:r>
+              <w:t>.lead_partners[1].practice_area }}</w:t>
             </w:r>
           </w:p>
         </w:tc>
@@ -7780,7 +7957,7 @@
         </w:trPr>
         <w:tc>
           <w:tcPr>
-            <w:tcW w:w="2918" w:type="dxa"/>
+            <w:tcW w:w="2955" w:type="dxa"/>
             <w:gridSpan w:val="2"/>
             <w:tcBorders>
               <w:top w:val="nil"/>
@@ -7803,7 +7980,7 @@
         </w:tc>
         <w:tc>
           <w:tcPr>
-            <w:tcW w:w="2963" w:type="dxa"/>
+            <w:tcW w:w="3001" w:type="dxa"/>
             <w:gridSpan w:val="2"/>
             <w:tcBorders>
               <w:top w:val="nil"/>
@@ -7826,7 +8003,7 @@
         </w:tc>
         <w:tc>
           <w:tcPr>
-            <w:tcW w:w="3135" w:type="dxa"/>
+            <w:tcW w:w="3060" w:type="dxa"/>
             <w:tcBorders>
               <w:top w:val="nil"/>
             </w:tcBorders>
@@ -7850,44 +8027,89 @@
       <w:tr>
         <w:tc>
           <w:tcPr>
-            <w:tcW w:w="2918" w:type="dxa"/>
+            <w:tcW w:w="2955" w:type="dxa"/>
             <w:gridSpan w:val="2"/>
             <w:shd w:val="clear" w:color="auto" w:fill="E2EFD9" w:themeFill="accent6" w:themeFillTint="33"/>
           </w:tcPr>
           <w:p>
-            <w:r>
-              <w:t>{{ matter.other_partners[0].name }}</w:t>
-            </w:r>
-          </w:p>
-        </w:tc>
-        <w:tc>
-          <w:tcPr>
-            <w:tcW w:w="2963" w:type="dxa"/>
+            <w:pPr>
+              <w:rPr>
+                <w:b/>
+                <w:sz w:val="28"/>
+                <w:szCs w:val="28"/>
+              </w:rPr>
+            </w:pPr>
+            <w:r>
+              <w:t xml:space="preserve">{{ </w:t>
+            </w:r>
+            <w:r>
+              <w:t>matter</w:t>
+            </w:r>
+            <w:r>
+              <w:t>.other_key_team_members[0].name }}</w:t>
+            </w:r>
+          </w:p>
+        </w:tc>
+        <w:tc>
+          <w:tcPr>
+            <w:tcW w:w="3001" w:type="dxa"/>
             <w:gridSpan w:val="2"/>
             <w:shd w:val="clear" w:color="auto" w:fill="E2EFD9" w:themeFill="accent6" w:themeFillTint="33"/>
           </w:tcPr>
           <w:p>
-            <w:r>
-              <w:t>{{ matter.other_partners[0].office }}</w:t>
-            </w:r>
-          </w:p>
-        </w:tc>
-        <w:tc>
-          <w:tcPr>
-            <w:tcW w:w="3135" w:type="dxa"/>
+            <w:pPr>
+              <w:rPr>
+                <w:b/>
+                <w:sz w:val="28"/>
+                <w:szCs w:val="28"/>
+              </w:rPr>
+            </w:pPr>
+            <w:r>
+              <w:t xml:space="preserve">{{ </w:t>
+            </w:r>
+            <w:r>
+              <w:t>matter</w:t>
+            </w:r>
+            <w:r>
+              <w:t>.other_key_team_members</w:t>
+            </w:r>
+            <w:r>
+              <w:t>[0]</w:t>
+            </w:r>
+            <w:r>
+              <w:t>.office }}</w:t>
+            </w:r>
+          </w:p>
+        </w:tc>
+        <w:tc>
+          <w:tcPr>
+            <w:tcW w:w="3060" w:type="dxa"/>
             <w:shd w:val="clear" w:color="auto" w:fill="E2EFD9" w:themeFill="accent6" w:themeFillTint="33"/>
           </w:tcPr>
           <w:p>
-            <w:r>
-              <w:t>{{ matter.other_partners[0].practice_area }}</w:t>
-            </w:r>
-          </w:p>
-        </w:tc>
-      </w:tr>
-      <w:tr>
-        <w:tc>
-          <w:tcPr>
-            <w:tcW w:w="2918" w:type="dxa"/>
+            <w:pPr>
+              <w:rPr>
+                <w:b/>
+                <w:sz w:val="28"/>
+                <w:szCs w:val="28"/>
+              </w:rPr>
+            </w:pPr>
+            <w:r>
+              <w:t xml:space="preserve">{{ </w:t>
+            </w:r>
+            <w:r>
+              <w:t>matter</w:t>
+            </w:r>
+            <w:r>
+              <w:t>.other_key_team_members[0].practice_area }}</w:t>
+            </w:r>
+          </w:p>
+        </w:tc>
+      </w:tr>
+      <w:tr>
+        <w:tc>
+          <w:tcPr>
+            <w:tcW w:w="2955" w:type="dxa"/>
             <w:gridSpan w:val="2"/>
             <w:tcBorders>
               <w:bottom w:val="single" w:sz="4" w:space="0" w:color="auto"/>
@@ -7895,14 +8117,27 @@
             <w:shd w:val="clear" w:color="auto" w:fill="E2EFD9" w:themeFill="accent6" w:themeFillTint="33"/>
           </w:tcPr>
           <w:p>
-            <w:r>
-              <w:t>{{ matter.other_partners[1].name }}</w:t>
-            </w:r>
-          </w:p>
-        </w:tc>
-        <w:tc>
-          <w:tcPr>
-            <w:tcW w:w="2963" w:type="dxa"/>
+            <w:pPr>
+              <w:rPr>
+                <w:b/>
+                <w:sz w:val="28"/>
+                <w:szCs w:val="28"/>
+              </w:rPr>
+            </w:pPr>
+            <w:r>
+              <w:t xml:space="preserve">{{ </w:t>
+            </w:r>
+            <w:r>
+              <w:t>matter</w:t>
+            </w:r>
+            <w:r>
+              <w:t>.other_key_team_members[1].name }}</w:t>
+            </w:r>
+          </w:p>
+        </w:tc>
+        <w:tc>
+          <w:tcPr>
+            <w:tcW w:w="3001" w:type="dxa"/>
             <w:gridSpan w:val="2"/>
             <w:tcBorders>
               <w:bottom w:val="single" w:sz="4" w:space="0" w:color="auto"/>
@@ -7910,22 +8145,48 @@
             <w:shd w:val="clear" w:color="auto" w:fill="E2EFD9" w:themeFill="accent6" w:themeFillTint="33"/>
           </w:tcPr>
           <w:p>
-            <w:r>
-              <w:t>{{ matter.other_partners[1].office }}</w:t>
-            </w:r>
-          </w:p>
-        </w:tc>
-        <w:tc>
-          <w:tcPr>
-            <w:tcW w:w="3135" w:type="dxa"/>
+            <w:pPr>
+              <w:rPr>
+                <w:b/>
+                <w:sz w:val="28"/>
+                <w:szCs w:val="28"/>
+              </w:rPr>
+            </w:pPr>
+            <w:r>
+              <w:t xml:space="preserve">{{ </w:t>
+            </w:r>
+            <w:r>
+              <w:t>matter</w:t>
+            </w:r>
+            <w:r>
+              <w:t>.other_key_team_members[1].office }}</w:t>
+            </w:r>
+          </w:p>
+        </w:tc>
+        <w:tc>
+          <w:tcPr>
+            <w:tcW w:w="3060" w:type="dxa"/>
             <w:tcBorders>
               <w:bottom w:val="single" w:sz="4" w:space="0" w:color="auto"/>
             </w:tcBorders>
             <w:shd w:val="clear" w:color="auto" w:fill="E2EFD9" w:themeFill="accent6" w:themeFillTint="33"/>
           </w:tcPr>
           <w:p>
-            <w:r>
-              <w:t>{{ matter.other_partners[1].practice_area }}</w:t>
+            <w:pPr>
+              <w:rPr>
+                <w:b/>
+                <w:sz w:val="28"/>
+                <w:szCs w:val="28"/>
+              </w:rPr>
+            </w:pPr>
+            <w:r>
+              <w:t xml:space="preserve">{{ </w:t>
+            </w:r>
+            <w:r>
+              <w:t>matter</w:t>
+            </w:r>
+            <w:r>
+              <w:t>.other_key_team_members[1].practice_area }}</w:t>
             </w:r>
           </w:p>
         </w:tc>
@@ -7968,7 +8229,7 @@
         </w:trPr>
         <w:tc>
           <w:tcPr>
-            <w:tcW w:w="2918" w:type="dxa"/>
+            <w:tcW w:w="2955" w:type="dxa"/>
             <w:gridSpan w:val="2"/>
             <w:tcBorders>
               <w:top w:val="nil"/>
@@ -7992,7 +8253,7 @@
         </w:tc>
         <w:tc>
           <w:tcPr>
-            <w:tcW w:w="2963" w:type="dxa"/>
+            <w:tcW w:w="3001" w:type="dxa"/>
             <w:gridSpan w:val="2"/>
             <w:tcBorders>
               <w:top w:val="nil"/>
@@ -8016,7 +8277,7 @@
         </w:tc>
         <w:tc>
           <w:tcPr>
-            <w:tcW w:w="3135" w:type="dxa"/>
+            <w:tcW w:w="3060" w:type="dxa"/>
             <w:tcBorders>
               <w:top w:val="nil"/>
               <w:bottom w:val="single" w:sz="4" w:space="0" w:color="auto"/>
@@ -8059,7 +8320,7 @@
         </w:trPr>
         <w:tc>
           <w:tcPr>
-            <w:tcW w:w="2918" w:type="dxa"/>
+            <w:tcW w:w="2955" w:type="dxa"/>
             <w:gridSpan w:val="2"/>
             <w:shd w:val="clear" w:color="auto" w:fill="E2EFD9" w:themeFill="accent6" w:themeFillTint="33"/>
           </w:tcPr>
@@ -8078,7 +8339,23 @@
                 <w:szCs w:val="28"/>
               </w:rPr>
               <w:lastRenderedPageBreak/>
-              <w:t>{{ matter.external_firms_advising[0].firm_name</w:t>
+              <w:t xml:space="preserve">{{ </w:t>
+            </w:r>
+            <w:r>
+              <w:rPr>
+                <w:b/>
+                <w:sz w:val="28"/>
+                <w:szCs w:val="28"/>
+              </w:rPr>
+              <w:t>matter</w:t>
+            </w:r>
+            <w:r>
+              <w:rPr>
+                <w:b/>
+                <w:sz w:val="28"/>
+                <w:szCs w:val="28"/>
+              </w:rPr>
+              <w:t>.external_firms_advising.firm_name</w:t>
             </w:r>
             <w:r>
               <w:rPr>
@@ -8092,7 +8369,7 @@
         </w:tc>
         <w:tc>
           <w:tcPr>
-            <w:tcW w:w="2963" w:type="dxa"/>
+            <w:tcW w:w="3001" w:type="dxa"/>
             <w:gridSpan w:val="2"/>
             <w:shd w:val="clear" w:color="auto" w:fill="E2EFD9" w:themeFill="accent6" w:themeFillTint="33"/>
           </w:tcPr>
@@ -8110,7 +8387,23 @@
                 <w:sz w:val="28"/>
                 <w:szCs w:val="28"/>
               </w:rPr>
-              <w:t>{{ matter.external_firms_advising[0].role_details</w:t>
+              <w:t xml:space="preserve">{{ </w:t>
+            </w:r>
+            <w:r>
+              <w:rPr>
+                <w:b/>
+                <w:sz w:val="28"/>
+                <w:szCs w:val="28"/>
+              </w:rPr>
+              <w:t>matter</w:t>
+            </w:r>
+            <w:r>
+              <w:rPr>
+                <w:b/>
+                <w:sz w:val="28"/>
+                <w:szCs w:val="28"/>
+              </w:rPr>
+              <w:t>.external_firms_advising[0].role_details</w:t>
             </w:r>
             <w:r>
               <w:rPr>
@@ -8124,7 +8417,7 @@
         </w:tc>
         <w:tc>
           <w:tcPr>
-            <w:tcW w:w="3135" w:type="dxa"/>
+            <w:tcW w:w="3060" w:type="dxa"/>
             <w:shd w:val="clear" w:color="auto" w:fill="E2EFD9" w:themeFill="accent6" w:themeFillTint="33"/>
           </w:tcPr>
           <w:p>
@@ -8141,7 +8434,23 @@
                 <w:sz w:val="28"/>
                 <w:szCs w:val="28"/>
               </w:rPr>
-              <w:t>{{ matter.external_firms_advising[0].entity_advised</w:t>
+              <w:t xml:space="preserve">{{ </w:t>
+            </w:r>
+            <w:r>
+              <w:rPr>
+                <w:b/>
+                <w:sz w:val="28"/>
+                <w:szCs w:val="28"/>
+              </w:rPr>
+              <w:t>matter</w:t>
+            </w:r>
+            <w:r>
+              <w:rPr>
+                <w:b/>
+                <w:sz w:val="28"/>
+                <w:szCs w:val="28"/>
+              </w:rPr>
+              <w:t>.external_firms_advising.entity_advised</w:t>
             </w:r>
             <w:r>
               <w:rPr>
@@ -8160,7 +8469,7 @@
         </w:trPr>
         <w:tc>
           <w:tcPr>
-            <w:tcW w:w="4721" w:type="dxa"/>
+            <w:tcW w:w="4510" w:type="dxa"/>
             <w:gridSpan w:val="3"/>
             <w:tcBorders>
               <w:bottom w:val="single" w:sz="4" w:space="0" w:color="auto"/>
@@ -8187,7 +8496,7 @@
         </w:tc>
         <w:tc>
           <w:tcPr>
-            <w:tcW w:w="4295" w:type="dxa"/>
+            <w:tcW w:w="4506" w:type="dxa"/>
             <w:gridSpan w:val="2"/>
             <w:tcBorders>
               <w:bottom w:val="single" w:sz="4" w:space="0" w:color="auto"/>
@@ -8216,7 +8525,7 @@
       <w:tr>
         <w:tc>
           <w:tcPr>
-            <w:tcW w:w="4721" w:type="dxa"/>
+            <w:tcW w:w="4510" w:type="dxa"/>
             <w:gridSpan w:val="3"/>
             <w:tcBorders>
               <w:bottom w:val="single" w:sz="4" w:space="0" w:color="auto"/>
@@ -8237,7 +8546,23 @@
                 <w:sz w:val="28"/>
                 <w:szCs w:val="28"/>
               </w:rPr>
-              <w:t>{{ matter.dates.start</w:t>
+              <w:t xml:space="preserve">{{ </w:t>
+            </w:r>
+            <w:r>
+              <w:rPr>
+                <w:b/>
+                <w:sz w:val="28"/>
+                <w:szCs w:val="28"/>
+              </w:rPr>
+              <w:t>matter</w:t>
+            </w:r>
+            <w:r>
+              <w:rPr>
+                <w:b/>
+                <w:sz w:val="28"/>
+                <w:szCs w:val="28"/>
+              </w:rPr>
+              <w:t>.dates.start</w:t>
             </w:r>
             <w:r>
               <w:rPr>
@@ -8251,7 +8576,7 @@
         </w:tc>
         <w:tc>
           <w:tcPr>
-            <w:tcW w:w="4295" w:type="dxa"/>
+            <w:tcW w:w="4506" w:type="dxa"/>
             <w:gridSpan w:val="2"/>
             <w:tcBorders>
               <w:bottom w:val="single" w:sz="4" w:space="0" w:color="auto"/>
@@ -8272,7 +8597,23 @@
                 <w:sz w:val="28"/>
                 <w:szCs w:val="28"/>
               </w:rPr>
-              <w:t>{{ matter.dates.end</w:t>
+              <w:t xml:space="preserve">{{ </w:t>
+            </w:r>
+            <w:r>
+              <w:rPr>
+                <w:b/>
+                <w:sz w:val="28"/>
+                <w:szCs w:val="28"/>
+              </w:rPr>
+              <w:t>matter</w:t>
+            </w:r>
+            <w:r>
+              <w:rPr>
+                <w:b/>
+                <w:sz w:val="28"/>
+                <w:szCs w:val="28"/>
+              </w:rPr>
+              <w:t>.dates.end</w:t>
             </w:r>
             <w:r>
               <w:rPr>
@@ -8287,12 +8628,6 @@
       </w:tr>
     </w:tbl>
     <w:p>
-      <w:r>
-        <w:tab/>
-      </w:r>
-      <w:r>
-        <w:tab/>
-      </w:r>
       <w:r>
         <w:tab/>
       </w:r>
@@ -8333,46 +8668,6 @@
       </w:r>
     </w:p>
     <w:p>
-      <w:pPr>
-        <w:rPr>
-          <w:b/>
-          <w:sz w:val="28"/>
-          <w:szCs w:val="28"/>
-        </w:rPr>
-      </w:pPr>
-      <w:r>
-        <w:tab/>
-      </w:r>
-      <w:r>
-        <w:tab/>
-      </w:r>
-      <w:r>
-        <w:tab/>
-      </w:r>
-      <w:r>
-        <w:tab/>
-      </w:r>
-      <w:r>
-        <w:tab/>
-      </w:r>
-      <w:r>
-        <w:tab/>
-      </w:r>
-      <w:r>
-        <w:tab/>
-      </w:r>
-      <w:r>
-        <w:tab/>
-      </w:r>
-      <w:r>
-        <w:tab/>
-      </w:r>
-      <w:r>
-        <w:tab/>
-      </w:r>
-      <w:r>
-        <w:tab/>
-      </w:r>
       <w:r>
         <w:tab/>
       </w:r>
@@ -8382,7 +8677,13 @@
     </w:p>
     <w:p>
       <w:r>
-        <w:t>{% for matter in non_publishable_matters %}</w:t>
+        <w:t xml:space="preserve">{% for matter in </w:t>
+      </w:r>
+      <w:r>
+        <w:t>confidential_matters</w:t>
+      </w:r>
+      <w:r>
+        <w:t xml:space="preserve"> %}</w:t>
       </w:r>
     </w:p>
     <w:p>
@@ -8415,9 +8716,9 @@
         <w:tblLook w:val="04A0" w:firstRow="1" w:lastRow="0" w:firstColumn="1" w:lastColumn="0" w:noHBand="0" w:noVBand="1"/>
       </w:tblPr>
       <w:tblGrid>
-        <w:gridCol w:w="2642"/>
-        <w:gridCol w:w="314"/>
-        <w:gridCol w:w="1626"/>
+        <w:gridCol w:w="2664"/>
+        <w:gridCol w:w="293"/>
+        <w:gridCol w:w="1625"/>
         <w:gridCol w:w="1377"/>
         <w:gridCol w:w="3062"/>
       </w:tblGrid>
@@ -8934,7 +9235,13 @@
           </w:tcPr>
           <w:p>
             <w:r>
-              <w:t>{{ matter.leading_partners[0].name }}</w:t>
+              <w:t>{{ matter.</w:t>
+            </w:r>
+            <w:r>
+              <w:t>lead</w:t>
+            </w:r>
+            <w:r>
+              <w:t>_partners[0].name }}</w:t>
             </w:r>
           </w:p>
         </w:tc>
@@ -8946,7 +9253,13 @@
           </w:tcPr>
           <w:p>
             <w:r>
-              <w:t>{{ matter.leading_partners[0].office }}</w:t>
+              <w:t>{{ matter.</w:t>
+            </w:r>
+            <w:r>
+              <w:t>lead</w:t>
+            </w:r>
+            <w:r>
+              <w:t>_partners[0].office }}</w:t>
             </w:r>
           </w:p>
         </w:tc>
@@ -8957,7 +9270,13 @@
           </w:tcPr>
           <w:p>
             <w:r>
-              <w:t>{{ matter.leading_partners[0].practice_area }}</w:t>
+              <w:t>{{ matter.</w:t>
+            </w:r>
+            <w:r>
+              <w:t>lead</w:t>
+            </w:r>
+            <w:r>
+              <w:t>_partners[0].practice_area }}</w:t>
             </w:r>
           </w:p>
         </w:tc>
@@ -8974,7 +9293,13 @@
           </w:tcPr>
           <w:p>
             <w:r>
-              <w:t>{{ matter.leading_partners[1].name }}</w:t>
+              <w:t>{{ matter.</w:t>
+            </w:r>
+            <w:r>
+              <w:t>lead</w:t>
+            </w:r>
+            <w:r>
+              <w:t>_partners[1].name }}</w:t>
             </w:r>
           </w:p>
         </w:tc>
@@ -8989,7 +9314,13 @@
           </w:tcPr>
           <w:p>
             <w:r>
-              <w:t>{{ matter.leading_partners[1].office }}</w:t>
+              <w:t>{{ matter.</w:t>
+            </w:r>
+            <w:r>
+              <w:t>lead</w:t>
+            </w:r>
+            <w:r>
+              <w:t>_partners[1].office }}</w:t>
             </w:r>
           </w:p>
         </w:tc>
@@ -9003,7 +9334,13 @@
           </w:tcPr>
           <w:p>
             <w:r>
-              <w:t>{{ matter.leading_partners[1].practice_area }}</w:t>
+              <w:t>{{ matter.</w:t>
+            </w:r>
+            <w:r>
+              <w:t>lead</w:t>
+            </w:r>
+            <w:r>
+              <w:t>_partners[1].practice_area }}</w:t>
             </w:r>
           </w:p>
         </w:tc>
@@ -9122,7 +9459,13 @@
           </w:tcPr>
           <w:p>
             <w:r>
-              <w:t>{{ matter.other_partners[0].name }}</w:t>
+              <w:t>{{ matter.</w:t>
+            </w:r>
+            <w:r>
+              <w:t>other_key_team_members</w:t>
+            </w:r>
+            <w:r>
+              <w:t>[0].name }}</w:t>
             </w:r>
           </w:p>
         </w:tc>
@@ -9134,7 +9477,13 @@
           </w:tcPr>
           <w:p>
             <w:r>
-              <w:t>{{ matter.other_partners[0].office }}</w:t>
+              <w:t>{{ matter.</w:t>
+            </w:r>
+            <w:r>
+              <w:t>other_key_team_members</w:t>
+            </w:r>
+            <w:r>
+              <w:t>[0].office }}</w:t>
             </w:r>
           </w:p>
         </w:tc>
@@ -9145,7 +9494,13 @@
           </w:tcPr>
           <w:p>
             <w:r>
-              <w:t>{{ matter.other_partners[0].practice_area }}</w:t>
+              <w:t>{{ matter.</w:t>
+            </w:r>
+            <w:r>
+              <w:t>other_key_team_members</w:t>
+            </w:r>
+            <w:r>
+              <w:t>[0].practice_area }}</w:t>
             </w:r>
           </w:p>
         </w:tc>
@@ -9162,7 +9517,13 @@
           </w:tcPr>
           <w:p>
             <w:r>
-              <w:t>{{ matter.other_partners[1].name }}</w:t>
+              <w:t>{{ matter.</w:t>
+            </w:r>
+            <w:r>
+              <w:t>other_key_team_members</w:t>
+            </w:r>
+            <w:r>
+              <w:t>[1].name }}</w:t>
             </w:r>
           </w:p>
         </w:tc>
@@ -9177,7 +9538,13 @@
           </w:tcPr>
           <w:p>
             <w:r>
-              <w:t>{{ matter.other_partners[1].office }}</w:t>
+              <w:t>{{ matter.</w:t>
+            </w:r>
+            <w:r>
+              <w:t>other_key_team_members</w:t>
+            </w:r>
+            <w:r>
+              <w:t>[1].office }}</w:t>
             </w:r>
           </w:p>
         </w:tc>
@@ -9191,7 +9558,13 @@
           </w:tcPr>
           <w:p>
             <w:r>
-              <w:t>{{ matter.other_partners[1].practice_area }}</w:t>
+              <w:t>{{ matter.</w:t>
+            </w:r>
+            <w:r>
+              <w:t>other_key_team_members</w:t>
+            </w:r>
+            <w:r>
+              <w:t>[1].practice_area }}</w:t>
             </w:r>
           </w:p>
         </w:tc>
@@ -9656,21 +10029,28 @@
         </w:rPr>
         <w:tab/>
       </w:r>
-      <w:r>
-        <w:rPr>
-          <w:b/>
-          <w:sz w:val="28"/>
-          <w:szCs w:val="28"/>
-        </w:rPr>
-        <w:tab/>
-      </w:r>
     </w:p>
     <w:p>
       <w:r>
         <w:t>{% endfor %}</w:t>
       </w:r>
-      <w:bookmarkStart w:id="0" w:name="_GoBack"/>
-      <w:bookmarkEnd w:id="0"/>
+    </w:p>
+    <w:p>
+      <w:pPr>
+        <w:rPr>
+          <w:b/>
+          <w:sz w:val="28"/>
+          <w:szCs w:val="28"/>
+        </w:rPr>
+      </w:pPr>
+      <w:r>
+        <w:rPr>
+          <w:b/>
+          <w:sz w:val="28"/>
+          <w:szCs w:val="28"/>
+        </w:rPr>
+        <w:tab/>
+      </w:r>
     </w:p>
     <w:sectPr>
       <w:footerReference w:type="default" r:id="rId11"/>
@@ -10746,7 +11126,7 @@
   <w:style w:type="paragraph" w:default="1" w:styleId="Normal">
     <w:name w:val="Normal"/>
     <w:qFormat/>
-    <w:rsid w:val="00505C95"/>
+    <w:rsid w:val="00D70149"/>
   </w:style>
   <w:style w:type="character" w:default="1" w:styleId="Fuentedeprrafopredeter">
     <w:name w:val="Default Paragraph Font"/>
@@ -11095,42 +11475,61 @@
   <w:rsids>
     <w:rsidRoot w:val="00900A9C"/>
     <w:rsid w:val="000B76D4"/>
+    <w:rsid w:val="000C06EE"/>
     <w:rsid w:val="00104D60"/>
     <w:rsid w:val="00164713"/>
+    <w:rsid w:val="001C155C"/>
     <w:rsid w:val="002A1746"/>
     <w:rsid w:val="002E5E10"/>
+    <w:rsid w:val="004B7739"/>
     <w:rsid w:val="004E0C32"/>
     <w:rsid w:val="004E7053"/>
     <w:rsid w:val="00537F16"/>
     <w:rsid w:val="0054595E"/>
+    <w:rsid w:val="00587BA4"/>
     <w:rsid w:val="005A285D"/>
     <w:rsid w:val="005A3F86"/>
     <w:rsid w:val="005B2B56"/>
+    <w:rsid w:val="005B3B9E"/>
+    <w:rsid w:val="006655E7"/>
+    <w:rsid w:val="006C6508"/>
     <w:rsid w:val="006E6C90"/>
+    <w:rsid w:val="007305E0"/>
     <w:rsid w:val="00731C27"/>
+    <w:rsid w:val="00733E04"/>
     <w:rsid w:val="00737085"/>
+    <w:rsid w:val="007518FA"/>
     <w:rsid w:val="00770F71"/>
     <w:rsid w:val="007A0B17"/>
     <w:rsid w:val="00800DDA"/>
+    <w:rsid w:val="008E08AA"/>
     <w:rsid w:val="00900A9C"/>
     <w:rsid w:val="009036B2"/>
     <w:rsid w:val="009060E0"/>
     <w:rsid w:val="00993352"/>
+    <w:rsid w:val="009B7FED"/>
     <w:rsid w:val="009E5603"/>
+    <w:rsid w:val="009E5DD5"/>
     <w:rsid w:val="00A23E5F"/>
     <w:rsid w:val="00A35D80"/>
     <w:rsid w:val="00A85A65"/>
     <w:rsid w:val="00A86275"/>
+    <w:rsid w:val="00A9301E"/>
     <w:rsid w:val="00B30D53"/>
     <w:rsid w:val="00B3584E"/>
     <w:rsid w:val="00C33D88"/>
     <w:rsid w:val="00CC0107"/>
+    <w:rsid w:val="00CF3153"/>
     <w:rsid w:val="00D22616"/>
+    <w:rsid w:val="00D9376C"/>
     <w:rsid w:val="00E456C7"/>
     <w:rsid w:val="00E714E0"/>
     <w:rsid w:val="00E909D1"/>
+    <w:rsid w:val="00EC1E30"/>
+    <w:rsid w:val="00F1245B"/>
     <w:rsid w:val="00F40B5F"/>
     <w:rsid w:val="00F532E5"/>
+    <w:rsid w:val="00FF15EA"/>
   </w:rsids>
   <m:mathPr>
     <m:mathFont m:val="Cambria Math"/>
@@ -11864,7 +12263,7 @@
 </file>
 
 <file path=customXml/itemProps1.xml><?xml version="1.0" encoding="utf-8"?>
-<ds:datastoreItem xmlns:ds="http://schemas.openxmlformats.org/officeDocument/2006/customXml" ds:itemID="{CB2EB24E-B0CF-4A20-ACF7-F0704726BB21}">
+<ds:datastoreItem xmlns:ds="http://schemas.openxmlformats.org/officeDocument/2006/customXml" ds:itemID="{2E6CC10F-CBB5-461E-9142-52D800D940AE}">
   <ds:schemaRefs>
     <ds:schemaRef ds:uri="http://schemas.openxmlformats.org/officeDocument/2006/bibliography"/>
   </ds:schemaRefs>

</xml_diff>